<commit_message>
Add late-return penalty support via negative Bonus Master POINTS
A negative POINTS value is now treated as a percentage penalty on
Master Scoring's Score (e.g. -25 = cut score 25%) instead of additive
points, with the single most severe penalty applying if more than one
is approved. This lets late-return bonuses (<15/<30/>30 min) model a
25/50/100% score reduction using ordinary Bonus Master rows, with no
other changes needed anywhere in the pipeline. Updates code.js,
SPEC.md, README.md, the install guide docx, and tests accordingly.

Co-Authored-By: Claude Sonnet 5 <noreply@anthropic.com>
</commit_message>
<xml_diff>
--- a/Rally_Scoring_Install_Guide.docx
+++ b/Rally_Scoring_Install_Guide.docx
@@ -258,10 +258,7 @@
         <w:pStyle w:val="FirstParagraph"/>
       </w:pPr>
       <w:r>
-        <w:t xml:space="preserve">Threads can contain up to three submission attempts. Any message in the thread can be approved or denied individually from the sidebar. Approvals and denials can be reverted back to</w:t>
-      </w:r>
-      <w:r>
-        <w:t xml:space="preserve"> </w:t>
+        <w:t xml:space="preserve">Threads can contain up to three submission attempts. Any message in the thread can be approved or denied individually from the sidebar. Approvals and denials can be reverted back to </w:t>
       </w:r>
       <w:r>
         <w:rPr>
@@ -270,10 +267,7 @@
         <w:t xml:space="preserve">needs-review</w:t>
       </w:r>
       <w:r>
-        <w:t xml:space="preserve"> </w:t>
-      </w:r>
-      <w:r>
-        <w:t xml:space="preserve">at any time.</w:t>
+        <w:t xml:space="preserve"> at any time.</w:t>
       </w:r>
     </w:p>
     <w:p>
@@ -281,10 +275,7 @@
         <w:pStyle w:val="BodyText"/>
       </w:pPr>
       <w:r>
-        <w:t xml:space="preserve">The</w:t>
-      </w:r>
-      <w:r>
-        <w:t xml:space="preserve"> </w:t>
+        <w:t xml:space="preserve">The </w:t>
       </w:r>
       <w:r>
         <w:rPr>
@@ -293,10 +284,7 @@
         <w:t xml:space="preserve">rally</w:t>
       </w:r>
       <w:r>
-        <w:t xml:space="preserve"> </w:t>
-      </w:r>
-      <w:r>
-        <w:t xml:space="preserve">parent label is also created so scorers can click it to see every submission at once regardless of status.</w:t>
+        <w:t xml:space="preserve"> parent label is also created so scorers can click it to see every submission at once regardless of status.</w:t>
       </w:r>
     </w:p>
     <w:p>
@@ -380,10 +368,7 @@
               <w:jc w:val="left"/>
             </w:pPr>
             <w:r>
-              <w:t xml:space="preserve">Main script —</w:t>
-            </w:r>
-            <w:r>
-              <w:t xml:space="preserve"> </w:t>
+              <w:t xml:space="preserve">Main script — </w:t>
             </w:r>
             <w:r>
               <w:rPr>
@@ -392,10 +377,7 @@
               <w:t xml:space="preserve">setup()</w:t>
             </w:r>
             <w:r>
-              <w:t xml:space="preserve">,</w:t>
-            </w:r>
-            <w:r>
-              <w:t xml:space="preserve"> </w:t>
+              <w:t xml:space="preserve">, </w:t>
             </w:r>
             <w:r>
               <w:rPr>
@@ -462,10 +444,7 @@
               <w:jc w:val="left"/>
             </w:pPr>
             <w:r>
-              <w:t xml:space="preserve">Manually-run helper(s) for testing — see</w:t>
-            </w:r>
-            <w:r>
-              <w:t xml:space="preserve"> </w:t>
+              <w:t xml:space="preserve">Manually-run helper(s) for testing — see </w:t>
             </w:r>
             <w:hyperlink w:anchor="utility-scripts">
               <w:r>
@@ -531,10 +510,7 @@
               <w:jc w:val="left"/>
             </w:pPr>
             <w:r>
-              <w:t xml:space="preserve">Unit tests (Node's built-in test runner) against mocked Gmail/Sheets services - see</w:t>
-            </w:r>
-            <w:r>
-              <w:t xml:space="preserve"> </w:t>
+              <w:t xml:space="preserve">Unit tests (Node's built-in test runner) against mocked Gmail/Sheets services - see </w:t>
             </w:r>
             <w:hyperlink w:anchor="testing">
               <w:r>
@@ -571,10 +547,7 @@
               <w:jc w:val="left"/>
             </w:pPr>
             <w:r>
-              <w:t xml:space="preserve">GNU GPL v3.0 or later — see</w:t>
-            </w:r>
-            <w:r>
-              <w:t xml:space="preserve"> </w:t>
+              <w:t xml:space="preserve">GNU GPL v3.0 or later — see </w:t>
             </w:r>
             <w:hyperlink w:anchor="license">
               <w:r>
@@ -616,13 +589,7 @@
         <w:t xml:space="preserve">test/support/mocks.js</w:t>
       </w:r>
       <w:r>
-        <w:t xml:space="preserve"> </w:t>
-      </w:r>
-      <w:r>
-        <w:t xml:space="preserve">implements minimal in-memory stand-ins for</w:t>
-      </w:r>
-      <w:r>
-        <w:t xml:space="preserve"> </w:t>
+        <w:t xml:space="preserve"> implements minimal in-memory stand-ins for </w:t>
       </w:r>
       <w:r>
         <w:rPr>
@@ -631,10 +598,7 @@
         <w:t xml:space="preserve">GmailApp</w:t>
       </w:r>
       <w:r>
-        <w:t xml:space="preserve">,</w:t>
-      </w:r>
-      <w:r>
-        <w:t xml:space="preserve"> </w:t>
+        <w:t xml:space="preserve">, </w:t>
       </w:r>
       <w:r>
         <w:rPr>
@@ -643,10 +607,7 @@
         <w:t xml:space="preserve">SpreadsheetApp</w:t>
       </w:r>
       <w:r>
-        <w:t xml:space="preserve">,</w:t>
-      </w:r>
-      <w:r>
-        <w:t xml:space="preserve"> </w:t>
+        <w:t xml:space="preserve">, </w:t>
       </w:r>
       <w:r>
         <w:rPr>
@@ -655,10 +616,7 @@
         <w:t xml:space="preserve">PropertiesService</w:t>
       </w:r>
       <w:r>
-        <w:t xml:space="preserve">,</w:t>
-      </w:r>
-      <w:r>
-        <w:t xml:space="preserve"> </w:t>
+        <w:t xml:space="preserve">, </w:t>
       </w:r>
       <w:r>
         <w:rPr>
@@ -667,10 +625,7 @@
         <w:t xml:space="preserve">LockService</w:t>
       </w:r>
       <w:r>
-        <w:t xml:space="preserve">,</w:t>
-      </w:r>
-      <w:r>
-        <w:t xml:space="preserve"> </w:t>
+        <w:t xml:space="preserve">, </w:t>
       </w:r>
       <w:r>
         <w:rPr>
@@ -679,10 +634,7 @@
         <w:t xml:space="preserve">ScriptApp</w:t>
       </w:r>
       <w:r>
-        <w:t xml:space="preserve">, and</w:t>
-      </w:r>
-      <w:r>
-        <w:t xml:space="preserve"> </w:t>
+        <w:t xml:space="preserve">, and </w:t>
       </w:r>
       <w:r>
         <w:rPr>
@@ -691,10 +643,7 @@
         <w:t xml:space="preserve">CardService</w:t>
       </w:r>
       <w:r>
-        <w:t xml:space="preserve">, then runs the real</w:t>
-      </w:r>
-      <w:r>
-        <w:t xml:space="preserve"> </w:t>
+        <w:t xml:space="preserve">, then runs the real </w:t>
       </w:r>
       <w:r>
         <w:rPr>
@@ -712,13 +661,7 @@
         <w:t xml:space="preserve">Sidebar.gs</w:t>
       </w:r>
       <w:r>
-        <w:t xml:space="preserve"> </w:t>
-      </w:r>
-      <w:r>
-        <w:t xml:space="preserve">source unmodified against them via Node's</w:t>
-      </w:r>
-      <w:r>
-        <w:t xml:space="preserve"> </w:t>
+        <w:t xml:space="preserve"> source unmodified against them via Node's </w:t>
       </w:r>
       <w:r>
         <w:rPr>
@@ -727,10 +670,7 @@
         <w:t xml:space="preserve">vm</w:t>
       </w:r>
       <w:r>
-        <w:t xml:space="preserve"> </w:t>
-      </w:r>
-      <w:r>
-        <w:t xml:space="preserve">module. No real Gmail/Sheets access, no network calls.</w:t>
+        <w:t xml:space="preserve"> module. No real Gmail/Sheets access, no network calls.</w:t>
       </w:r>
     </w:p>
     <w:p>
@@ -749,10 +689,7 @@
         <w:pStyle w:val="FirstParagraph"/>
       </w:pPr>
       <w:r>
-        <w:t xml:space="preserve">Requires Node 18+ (uses the built-in</w:t>
-      </w:r>
-      <w:r>
-        <w:t xml:space="preserve"> </w:t>
+        <w:t xml:space="preserve">Requires Node 18+ (uses the built-in </w:t>
       </w:r>
       <w:r>
         <w:rPr>
@@ -761,10 +698,7 @@
         <w:t xml:space="preserve">node:test</w:t>
       </w:r>
       <w:r>
-        <w:t xml:space="preserve"> </w:t>
-      </w:r>
-      <w:r>
-        <w:t xml:space="preserve">runner - no dependencies to install).</w:t>
+        <w:t xml:space="preserve"> runner - no dependencies to install).</w:t>
       </w:r>
     </w:p>
     <w:p>
@@ -789,10 +723,7 @@
         <w:pStyle w:val="FirstParagraph"/>
       </w:pPr>
       <w:r>
-        <w:t xml:space="preserve">All configuration is read at runtime from a</w:t>
-      </w:r>
-      <w:r>
-        <w:t xml:space="preserve"> </w:t>
+        <w:t xml:space="preserve">All configuration is read at runtime from a </w:t>
       </w:r>
       <w:r>
         <w:rPr>
@@ -802,10 +733,7 @@
         <w:t xml:space="preserve">Config</w:t>
       </w:r>
       <w:r>
-        <w:t xml:space="preserve"> </w:t>
-      </w:r>
-      <w:r>
-        <w:t xml:space="preserve">sheet.</w:t>
+        <w:t xml:space="preserve"> sheet.</w:t>
       </w:r>
     </w:p>
     <w:bookmarkStart w:id="23" w:name="config-sheet"/>
@@ -822,10 +750,7 @@
         <w:pStyle w:val="FirstParagraph"/>
       </w:pPr>
       <w:r>
-        <w:t xml:space="preserve">A tab named exactly</w:t>
-      </w:r>
-      <w:r>
-        <w:t xml:space="preserve"> </w:t>
+        <w:t xml:space="preserve">A tab named exactly </w:t>
       </w:r>
       <w:r>
         <w:rPr>
@@ -834,10 +759,7 @@
         <w:t xml:space="preserve">Config</w:t>
       </w:r>
       <w:r>
-        <w:t xml:space="preserve">, with</w:t>
-      </w:r>
-      <w:r>
-        <w:t xml:space="preserve"> </w:t>
+        <w:t xml:space="preserve">, with </w:t>
       </w:r>
       <w:r>
         <w:rPr>
@@ -846,10 +768,7 @@
         <w:t xml:space="preserve">key</w:t>
       </w:r>
       <w:r>
-        <w:t xml:space="preserve">,</w:t>
-      </w:r>
-      <w:r>
-        <w:t xml:space="preserve"> </w:t>
+        <w:t xml:space="preserve">, </w:t>
       </w:r>
       <w:r>
         <w:rPr>
@@ -858,10 +777,7 @@
         <w:t xml:space="preserve">value</w:t>
       </w:r>
       <w:r>
-        <w:t xml:space="preserve">,</w:t>
-      </w:r>
-      <w:r>
-        <w:t xml:space="preserve"> </w:t>
+        <w:t xml:space="preserve">, </w:t>
       </w:r>
       <w:r>
         <w:rPr>
@@ -870,13 +786,7 @@
         <w:t xml:space="preserve">notes</w:t>
       </w:r>
       <w:r>
-        <w:t xml:space="preserve"> </w:t>
-      </w:r>
-      <w:r>
-        <w:t xml:space="preserve">columns, populated by hand from the</w:t>
-      </w:r>
-      <w:r>
-        <w:t xml:space="preserve"> </w:t>
+        <w:t xml:space="preserve"> columns, populated by hand from the </w:t>
       </w:r>
       <w:hyperlink w:anchor="config-sheet-reference">
         <w:r>
@@ -887,13 +797,7 @@
         </w:r>
       </w:hyperlink>
       <w:r>
-        <w:t xml:space="preserve"> </w:t>
-      </w:r>
-      <w:r>
-        <w:t xml:space="preserve">below. See</w:t>
-      </w:r>
-      <w:r>
-        <w:t xml:space="preserve"> </w:t>
+        <w:t xml:space="preserve"> below. See </w:t>
       </w:r>
       <w:hyperlink w:anchor="installation">
         <w:r>
@@ -904,10 +808,7 @@
         </w:r>
       </w:hyperlink>
       <w:r>
-        <w:t xml:space="preserve"> </w:t>
-      </w:r>
-      <w:r>
-        <w:t xml:space="preserve">for setup steps.</w:t>
+        <w:t xml:space="preserve"> for setup steps.</w:t>
       </w:r>
     </w:p>
     <w:bookmarkEnd w:id="23"/>
@@ -925,10 +826,7 @@
         <w:pStyle w:val="FirstParagraph"/>
       </w:pPr>
       <w:r>
-        <w:t xml:space="preserve">A tab named</w:t>
-      </w:r>
-      <w:r>
-        <w:t xml:space="preserve"> </w:t>
+        <w:t xml:space="preserve">A tab named </w:t>
       </w:r>
       <w:r>
         <w:rPr>
@@ -939,10 +837,7 @@
         <w:t xml:space="preserve">Rider Master</w:t>
       </w:r>
       <w:r>
-        <w:t xml:space="preserve"> </w:t>
-      </w:r>
-      <w:r>
-        <w:t xml:space="preserve">(configurable). Row 1 is headers:</w:t>
+        <w:t xml:space="preserve"> (configurable). Row 1 is headers:</w:t>
       </w:r>
     </w:p>
     <w:tbl>
@@ -1108,10 +1003,7 @@
         <w:pStyle w:val="FirstParagraph"/>
       </w:pPr>
       <w:r>
-        <w:t xml:space="preserve">A tab named</w:t>
-      </w:r>
-      <w:r>
-        <w:t xml:space="preserve"> </w:t>
+        <w:t xml:space="preserve">A tab named </w:t>
       </w:r>
       <w:r>
         <w:rPr>
@@ -1122,10 +1014,7 @@
         <w:t xml:space="preserve">Bonus Master</w:t>
       </w:r>
       <w:r>
-        <w:t xml:space="preserve"> </w:t>
-      </w:r>
-      <w:r>
-        <w:t xml:space="preserve">(configurable). Column A lists every bonus ID, column B its point value (</w:t>
+        <w:t xml:space="preserve"> (configurable). Column A lists every bonus ID, column B its point value (</w:t>
       </w:r>
       <w:r>
         <w:rPr>
@@ -1244,13 +1133,7 @@
         <w:t xml:space="preserve">='Bonus Master'!A2</w:t>
       </w:r>
       <w:r>
-        <w:t xml:space="preserve"> </w:t>
-      </w:r>
-      <w:r>
-        <w:t xml:space="preserve">etc.) so any updates to Bonus Master propagate automatically.</w:t>
-      </w:r>
-      <w:r>
-        <w:t xml:space="preserve"> </w:t>
+        <w:t xml:space="preserve"> etc.) so any updates to Bonus Master propagate automatically. </w:t>
       </w:r>
       <w:r>
         <w:rPr>
@@ -1259,13 +1142,7 @@
         <w:t xml:space="preserve">POINTS</w:t>
       </w:r>
       <w:r>
-        <w:t xml:space="preserve"> </w:t>
-      </w:r>
-      <w:r>
-        <w:t xml:space="preserve">is read by</w:t>
-      </w:r>
-      <w:r>
-        <w:t xml:space="preserve"> </w:t>
+        <w:t xml:space="preserve"> is read by </w:t>
       </w:r>
       <w:hyperlink w:anchor="master-scoring">
         <w:r>
@@ -1276,10 +1153,7 @@
         </w:r>
       </w:hyperlink>
       <w:r>
-        <w:t xml:space="preserve"> </w:t>
-      </w:r>
-      <w:r>
-        <w:t xml:space="preserve">— a blank or non-numeric value there just counts as 0, logged as a warning only when it's non-blank but not a number.</w:t>
+        <w:t xml:space="preserve"> — a blank or non-numeric value there just counts as 0, logged as a warning only when it's non-blank but not a number.</w:t>
       </w:r>
     </w:p>
     <w:p>
@@ -1291,16 +1165,332 @@
           <w:bCs/>
           <w:b/>
         </w:rPr>
+        <w:t xml:space="preserve">A negative POINTS value is a percentage penalty, not points to add</w:t>
+      </w:r>
+      <w:r>
+        <w:t xml:space="preserve"> — e.g. a "&lt;15 min late" bonus with </w:t>
+      </w:r>
+      <w:r>
+        <w:rPr>
+          <w:rStyle w:val="VerbatimChar"/>
+        </w:rPr>
+        <w:t xml:space="preserve">POINTS</w:t>
+      </w:r>
+      <w:r>
+        <w:t xml:space="preserve"> set to </w:t>
+      </w:r>
+      <w:r>
+        <w:rPr>
+          <w:rStyle w:val="VerbatimChar"/>
+        </w:rPr>
+        <w:t xml:space="preserve">-25</w:t>
+      </w:r>
+      <w:r>
+        <w:t xml:space="preserve"> cuts that rider's final </w:t>
+      </w:r>
+      <w:hyperlink w:anchor="master-scoring">
+        <w:r>
+          <w:rPr>
+            <w:rStyle w:val="Hyperlink"/>
+          </w:rPr>
+          <w:t xml:space="preserve">Master Scoring</w:t>
+        </w:r>
+      </w:hyperlink>
+      <w:r>
+        <w:t xml:space="preserve"> </w:t>
+      </w:r>
+      <w:r>
+        <w:rPr>
+          <w:rStyle w:val="VerbatimChar"/>
+        </w:rPr>
+        <w:t xml:space="preserve">Score</w:t>
+      </w:r>
+      <w:r>
+        <w:t xml:space="preserve"> by 25% if approved, </w:t>
+      </w:r>
+      <w:r>
+        <w:rPr>
+          <w:rStyle w:val="VerbatimChar"/>
+        </w:rPr>
+        <w:t xml:space="preserve">-50</w:t>
+      </w:r>
+      <w:r>
+        <w:t xml:space="preserve"> by half, </w:t>
+      </w:r>
+      <w:r>
+        <w:rPr>
+          <w:rStyle w:val="VerbatimChar"/>
+        </w:rPr>
+        <w:t xml:space="preserve">-100</w:t>
+      </w:r>
+      <w:r>
+        <w:t xml:space="preserve"> to zero. Add each penalty tier as its own ordinary Bonus Master row (any code fitting the </w:t>
+      </w:r>
+      <w:hyperlink w:anchor="submission-format">
+        <w:r>
+          <w:rPr>
+            <w:rStyle w:val="Hyperlink"/>
+          </w:rPr>
+          <w:t xml:space="preserve">submission format</w:t>
+        </w:r>
+      </w:hyperlink>
+      <w:r>
+        <w:t xml:space="preserve"> works — </w:t>
+      </w:r>
+      <w:r>
+        <w:rPr>
+          <w:rStyle w:val="VerbatimChar"/>
+        </w:rPr>
+        <w:t xml:space="preserve">LAT1</w:t>
+      </w:r>
+      <w:r>
+        <w:t xml:space="preserve">/</w:t>
+      </w:r>
+      <w:r>
+        <w:rPr>
+          <w:rStyle w:val="VerbatimChar"/>
+        </w:rPr>
+        <w:t xml:space="preserve">LAT2</w:t>
+      </w:r>
+      <w:r>
+        <w:t xml:space="preserve">/</w:t>
+      </w:r>
+      <w:r>
+        <w:rPr>
+          <w:rStyle w:val="VerbatimChar"/>
+        </w:rPr>
+        <w:t xml:space="preserve">LAT3</w:t>
+      </w:r>
+      <w:r>
+        <w:t xml:space="preserve"> is one option):</w:t>
+      </w:r>
+    </w:p>
+    <w:tbl>
+      <w:tblPr>
+        <w:tblStyle w:val="Table"/>
+        <w:tblW w:type="auto" w:w="0"/>
+        <w:tblLook w:firstRow="1" w:lastRow="0" w:firstColumn="0" w:lastColumn="0" w:noHBand="0" w:noVBand="0" w:val="0020"/>
+        <w:jc w:val="start"/>
+      </w:tblPr>
+      <w:tblGrid>
+        <w:gridCol w:w="2640"/>
+        <w:gridCol w:w="2640"/>
+        <w:gridCol w:w="2640"/>
+      </w:tblGrid>
+      <w:tr>
+        <w:trPr>
+          <w:tblHeader w:val="true"/>
+        </w:trPr>
+        <w:tc>
+          <w:tcPr/>
+          <w:p>
+            <w:pPr>
+              <w:pStyle w:val="Compact"/>
+              <w:jc w:val="left"/>
+            </w:pPr>
+            <w:r>
+              <w:t xml:space="preserve">Bonus ID</w:t>
+            </w:r>
+          </w:p>
+        </w:tc>
+        <w:tc>
+          <w:tcPr/>
+          <w:p>
+            <w:pPr>
+              <w:pStyle w:val="Compact"/>
+              <w:jc w:val="left"/>
+            </w:pPr>
+            <w:r>
+              <w:t xml:space="preserve">POINTS</w:t>
+            </w:r>
+          </w:p>
+        </w:tc>
+        <w:tc>
+          <w:tcPr/>
+          <w:p>
+            <w:pPr>
+              <w:pStyle w:val="Compact"/>
+              <w:jc w:val="left"/>
+            </w:pPr>
+            <w:r>
+              <w:t xml:space="preserve">Meaning</w:t>
+            </w:r>
+          </w:p>
+        </w:tc>
+      </w:tr>
+      <w:tr>
+        <w:tc>
+          <w:tcPr/>
+          <w:p>
+            <w:pPr>
+              <w:pStyle w:val="Compact"/>
+              <w:jc w:val="left"/>
+            </w:pPr>
+            <w:r>
+              <w:rPr>
+                <w:rStyle w:val="VerbatimChar"/>
+              </w:rPr>
+              <w:t xml:space="preserve">LAT1</w:t>
+            </w:r>
+          </w:p>
+        </w:tc>
+        <w:tc>
+          <w:tcPr/>
+          <w:p>
+            <w:pPr>
+              <w:pStyle w:val="Compact"/>
+              <w:jc w:val="left"/>
+            </w:pPr>
+            <w:r>
+              <w:rPr>
+                <w:rStyle w:val="VerbatimChar"/>
+              </w:rPr>
+              <w:t xml:space="preserve">-25</w:t>
+            </w:r>
+          </w:p>
+        </w:tc>
+        <w:tc>
+          <w:tcPr/>
+          <w:p>
+            <w:pPr>
+              <w:pStyle w:val="Compact"/>
+              <w:jc w:val="left"/>
+            </w:pPr>
+            <w:r>
+              <w:t xml:space="preserve">&lt;15 min late — 25% reduction</w:t>
+            </w:r>
+          </w:p>
+        </w:tc>
+      </w:tr>
+      <w:tr>
+        <w:tc>
+          <w:tcPr/>
+          <w:p>
+            <w:pPr>
+              <w:pStyle w:val="Compact"/>
+              <w:jc w:val="left"/>
+            </w:pPr>
+            <w:r>
+              <w:rPr>
+                <w:rStyle w:val="VerbatimChar"/>
+              </w:rPr>
+              <w:t xml:space="preserve">LAT2</w:t>
+            </w:r>
+          </w:p>
+        </w:tc>
+        <w:tc>
+          <w:tcPr/>
+          <w:p>
+            <w:pPr>
+              <w:pStyle w:val="Compact"/>
+              <w:jc w:val="left"/>
+            </w:pPr>
+            <w:r>
+              <w:rPr>
+                <w:rStyle w:val="VerbatimChar"/>
+              </w:rPr>
+              <w:t xml:space="preserve">-50</w:t>
+            </w:r>
+          </w:p>
+        </w:tc>
+        <w:tc>
+          <w:tcPr/>
+          <w:p>
+            <w:pPr>
+              <w:pStyle w:val="Compact"/>
+              <w:jc w:val="left"/>
+            </w:pPr>
+            <w:r>
+              <w:t xml:space="preserve">&lt;30 min late — 50% reduction</w:t>
+            </w:r>
+          </w:p>
+        </w:tc>
+      </w:tr>
+      <w:tr>
+        <w:tc>
+          <w:tcPr/>
+          <w:p>
+            <w:pPr>
+              <w:pStyle w:val="Compact"/>
+              <w:jc w:val="left"/>
+            </w:pPr>
+            <w:r>
+              <w:rPr>
+                <w:rStyle w:val="VerbatimChar"/>
+              </w:rPr>
+              <w:t xml:space="preserve">LAT3</w:t>
+            </w:r>
+          </w:p>
+        </w:tc>
+        <w:tc>
+          <w:tcPr/>
+          <w:p>
+            <w:pPr>
+              <w:pStyle w:val="Compact"/>
+              <w:jc w:val="left"/>
+            </w:pPr>
+            <w:r>
+              <w:rPr>
+                <w:rStyle w:val="VerbatimChar"/>
+              </w:rPr>
+              <w:t xml:space="preserve">-100</w:t>
+            </w:r>
+          </w:p>
+        </w:tc>
+        <w:tc>
+          <w:tcPr/>
+          <w:p>
+            <w:pPr>
+              <w:pStyle w:val="Compact"/>
+              <w:jc w:val="left"/>
+            </w:pPr>
+            <w:r>
+              <w:t xml:space="preserve">&gt;30 min late — 100% reduction (zeroes the score)</w:t>
+            </w:r>
+          </w:p>
+        </w:tc>
+      </w:tr>
+    </w:tbl>
+    <w:p>
+      <w:pPr>
+        <w:pStyle w:val="BodyText"/>
+      </w:pPr>
+      <w:r>
+        <w:t xml:space="preserve">Nothing else is needed — they propagate into rider sheets and get Approved exactly like any bonus (typically the scorer just marks the Approved cell directly, rather than the rider emailing one in, though nothing stops that either). If more than one negative-</w:t>
+      </w:r>
+      <w:r>
+        <w:rPr>
+          <w:rStyle w:val="VerbatimChar"/>
+        </w:rPr>
+        <w:t xml:space="preserve">POINTS</w:t>
+      </w:r>
+      <w:r>
+        <w:t xml:space="preserve"> bonus somehow ends up Approved for the same rider, only the </w:t>
+      </w:r>
+      <w:r>
+        <w:rPr>
+          <w:bCs/>
+          <w:b/>
+        </w:rPr>
+        <w:t xml:space="preserve">single worst</w:t>
+      </w:r>
+      <w:r>
+        <w:t xml:space="preserve"> one applies — not a compounded stack of all of them.</w:t>
+      </w:r>
+    </w:p>
+    <w:p>
+      <w:pPr>
+        <w:pStyle w:val="BodyText"/>
+      </w:pPr>
+      <w:r>
+        <w:rPr>
+          <w:bCs/>
+          <w:b/>
+        </w:rPr>
         <w:t xml:space="preserve">Combination bonuses go here too, exactly like any other bonus</w:t>
       </w:r>
       <w:r>
-        <w:t xml:space="preserve"> </w:t>
-      </w:r>
-      <w:r>
-        <w:t xml:space="preserve">— see</w:t>
-      </w:r>
-      <w:r>
-        <w:t xml:space="preserve"> </w:t>
+        <w:t xml:space="preserve"> — see </w:t>
       </w:r>
       <w:hyperlink w:anchor="combination-bonuses">
         <w:r>
@@ -1311,13 +1501,7 @@
         </w:r>
       </w:hyperlink>
       <w:r>
-        <w:t xml:space="preserve"> </w:t>
-      </w:r>
-      <w:r>
-        <w:t xml:space="preserve">below, and</w:t>
-      </w:r>
-      <w:r>
-        <w:t xml:space="preserve"> </w:t>
+        <w:t xml:space="preserve"> below, and </w:t>
       </w:r>
       <w:hyperlink w:anchor="combo-master">
         <w:r>
@@ -1328,10 +1512,7 @@
         </w:r>
       </w:hyperlink>
       <w:r>
-        <w:t xml:space="preserve"> </w:t>
-      </w:r>
-      <w:r>
-        <w:t xml:space="preserve">if you want them auto-approved in Master Scoring once their component bonuses are done.</w:t>
+        <w:t xml:space="preserve"> if you want them auto-approved in Master Scoring once their component bonuses are done.</w:t>
       </w:r>
     </w:p>
     <w:bookmarkEnd w:id="27"/>
@@ -1349,10 +1530,7 @@
         <w:pStyle w:val="FirstParagraph"/>
       </w:pPr>
       <w:r>
-        <w:t xml:space="preserve">An</w:t>
-      </w:r>
-      <w:r>
-        <w:t xml:space="preserve"> </w:t>
+        <w:t xml:space="preserve">An </w:t>
       </w:r>
       <w:r>
         <w:rPr>
@@ -1362,13 +1540,7 @@
         <w:t xml:space="preserve">optional</w:t>
       </w:r>
       <w:r>
-        <w:t xml:space="preserve"> </w:t>
-      </w:r>
-      <w:r>
-        <w:t xml:space="preserve">tab named</w:t>
-      </w:r>
-      <w:r>
-        <w:t xml:space="preserve"> </w:t>
+        <w:t xml:space="preserve"> tab named </w:t>
       </w:r>
       <w:r>
         <w:rPr>
@@ -1379,13 +1551,7 @@
         <w:t xml:space="preserve">Combo Master</w:t>
       </w:r>
       <w:r>
-        <w:t xml:space="preserve"> </w:t>
-      </w:r>
-      <w:r>
-        <w:t xml:space="preserve">(configurable via</w:t>
-      </w:r>
-      <w:r>
-        <w:t xml:space="preserve"> </w:t>
+        <w:t xml:space="preserve"> (configurable via </w:t>
       </w:r>
       <w:r>
         <w:rPr>
@@ -1394,10 +1560,7 @@
         <w:t xml:space="preserve">sheet_combo_master</w:t>
       </w:r>
       <w:r>
-        <w:t xml:space="preserve">) — only needed if you want</w:t>
-      </w:r>
-      <w:r>
-        <w:t xml:space="preserve"> </w:t>
+        <w:t xml:space="preserve">) — only needed if you want </w:t>
       </w:r>
       <w:hyperlink w:anchor="master-scoring">
         <w:r>
@@ -1408,13 +1571,7 @@
         </w:r>
       </w:hyperlink>
       <w:r>
-        <w:t xml:space="preserve"> </w:t>
-      </w:r>
-      <w:r>
-        <w:t xml:space="preserve">to auto-approve a combination bonus once its component bonuses are approved. Never created or read by anything except</w:t>
-      </w:r>
-      <w:r>
-        <w:t xml:space="preserve"> </w:t>
+        <w:t xml:space="preserve"> to auto-approve a combination bonus once its component bonuses are approved. Never created or read by anything except </w:t>
       </w:r>
       <w:r>
         <w:rPr>
@@ -1423,10 +1580,7 @@
         <w:t xml:space="preserve">createMasterScoring_</w:t>
       </w:r>
       <w:r>
-        <w:t xml:space="preserve">; leave it out entirely if you don't use combos. Two columns,</w:t>
-      </w:r>
-      <w:r>
-        <w:t xml:space="preserve"> </w:t>
+        <w:t xml:space="preserve">; leave it out entirely if you don't use combos. Two columns, </w:t>
       </w:r>
       <w:r>
         <w:rPr>
@@ -1436,10 +1590,7 @@
         <w:t xml:space="preserve">one row per (combo code, member bonus code) pair</w:t>
       </w:r>
       <w:r>
-        <w:t xml:space="preserve"> </w:t>
-      </w:r>
-      <w:r>
-        <w:t xml:space="preserve">— a combo with 5 members is just 5 rows sharing the same combo code, no fixed limit either way:</w:t>
+        <w:t xml:space="preserve"> — a combo with 5 members is just 5 rows sharing the same combo code, no fixed limit either way:</w:t>
       </w:r>
     </w:p>
     <w:tbl>
@@ -1540,10 +1691,7 @@
         <w:pStyle w:val="BodyText"/>
       </w:pPr>
       <w:r>
-        <w:t xml:space="preserve">Both the combo code and every member code must</w:t>
-      </w:r>
-      <w:r>
-        <w:t xml:space="preserve"> </w:t>
+        <w:t xml:space="preserve">Both the combo code and every member code must </w:t>
       </w:r>
       <w:r>
         <w:rPr>
@@ -1553,13 +1701,7 @@
         <w:t xml:space="preserve">also</w:t>
       </w:r>
       <w:r>
-        <w:t xml:space="preserve"> </w:t>
-      </w:r>
-      <w:r>
-        <w:t xml:space="preserve">be an ordinary row in Bonus Master (with its own</w:t>
-      </w:r>
-      <w:r>
-        <w:t xml:space="preserve"> </w:t>
+        <w:t xml:space="preserve"> be an ordinary row in Bonus Master (with its own </w:t>
       </w:r>
       <w:r>
         <w:rPr>
@@ -1568,10 +1710,7 @@
         <w:t xml:space="preserve">POINTS</w:t>
       </w:r>
       <w:r>
-        <w:t xml:space="preserve"> </w:t>
-      </w:r>
-      <w:r>
-        <w:t xml:space="preserve">value) — Combo Master only maps codes to each other, it doesn't replace a Bonus Master entry or give the combo a rider-sheet row of its own. A code Combo Master references that isn't in Bonus Master is logged and that combo is skipped (falls back to behaving like a normal, non-combo bonus row) — never an error.</w:t>
+        <w:t xml:space="preserve"> value) — Combo Master only maps codes to each other, it doesn't replace a Bonus Master entry or give the combo a rider-sheet row of its own. A code Combo Master references that isn't in Bonus Master is logged and that combo is skipped (falls back to behaving like a normal, non-combo bonus row) — never an error.</w:t>
       </w:r>
     </w:p>
     <w:p>
@@ -1583,53 +1722,34 @@
           <w:bCs/>
           <w:b/>
         </w:rPr>
-        <w:t xml:space="preserve">Set combos up before the first time you run</w:t>
-      </w:r>
-      <w:r>
-        <w:rPr>
+        <w:t xml:space="preserve">Set combos up before the first time you run </w:t>
+      </w:r>
+      <w:r>
+        <w:rPr>
+          <w:rStyle w:val="VerbatimChar"/>
           <w:bCs/>
           <w:b/>
         </w:rPr>
-        <w:t xml:space="preserve"> </w:t>
-      </w:r>
-      <w:r>
-        <w:rPr>
-          <w:rStyle w:val="VerbatimChar"/>
+        <w:t xml:space="preserve">setup()</w:t>
+      </w:r>
+      <w:r>
+        <w:rPr>
           <w:bCs/>
           <w:b/>
         </w:rPr>
+        <w:t xml:space="preserve">.</w:t>
+      </w:r>
+      <w:r>
+        <w:t xml:space="preserve"> There's no mechanism to retroactively add a row to a rider sheet that already exists (the same limitation that already applies to adding any regular bonus mid-event) — so a combo (and its members) added to Bonus Master/Combo Master after rider sheets already exist won't get a row on those sheets, or a fully-working auto-approval cell in Master Scoring, until you delete and let </w:t>
+      </w:r>
+      <w:r>
+        <w:rPr>
+          <w:rStyle w:val="VerbatimChar"/>
+        </w:rPr>
         <w:t xml:space="preserve">setup()</w:t>
       </w:r>
       <w:r>
-        <w:rPr>
-          <w:bCs/>
-          <w:b/>
-        </w:rPr>
-        <w:t xml:space="preserve">.</w:t>
-      </w:r>
-      <w:r>
-        <w:t xml:space="preserve"> </w:t>
-      </w:r>
-      <w:r>
-        <w:t xml:space="preserve">There's no mechanism to retroactively add a row to a rider sheet that already exists (the same limitation that already applies to adding any regular bonus mid-event) — so a combo (and its members) added to Bonus Master/Combo Master after rider sheets already exist won't get a row on those sheets, or a fully-working auto-approval cell in Master Scoring, until you delete and let</w:t>
-      </w:r>
-      <w:r>
-        <w:t xml:space="preserve"> </w:t>
-      </w:r>
-      <w:r>
-        <w:rPr>
-          <w:rStyle w:val="VerbatimChar"/>
-        </w:rPr>
-        <w:t xml:space="preserve">setup()</w:t>
-      </w:r>
-      <w:r>
-        <w:t xml:space="preserve"> </w:t>
-      </w:r>
-      <w:r>
-        <w:t xml:space="preserve">regenerate them (see</w:t>
-      </w:r>
-      <w:r>
-        <w:t xml:space="preserve"> </w:t>
+        <w:t xml:space="preserve"> regenerate them (see </w:t>
       </w:r>
       <w:hyperlink w:anchor="utility-scripts">
         <w:r>
@@ -1658,10 +1778,7 @@
         <w:pStyle w:val="FirstParagraph"/>
       </w:pPr>
       <w:r>
-        <w:t xml:space="preserve">A tab named</w:t>
-      </w:r>
-      <w:r>
-        <w:t xml:space="preserve"> </w:t>
+        <w:t xml:space="preserve">A tab named </w:t>
       </w:r>
       <w:r>
         <w:rPr>
@@ -1672,13 +1789,7 @@
         <w:t xml:space="preserve">Master Scoring</w:t>
       </w:r>
       <w:r>
-        <w:t xml:space="preserve"> </w:t>
-      </w:r>
-      <w:r>
-        <w:t xml:space="preserve">(configurable via</w:t>
-      </w:r>
-      <w:r>
-        <w:t xml:space="preserve"> </w:t>
+        <w:t xml:space="preserve"> (configurable via </w:t>
       </w:r>
       <w:r>
         <w:rPr>
@@ -1687,10 +1798,7 @@
         <w:t xml:space="preserve">sheet_master_scoring</w:t>
       </w:r>
       <w:r>
-        <w:t xml:space="preserve">), created by</w:t>
-      </w:r>
-      <w:r>
-        <w:t xml:space="preserve"> </w:t>
+        <w:t xml:space="preserve">), created by </w:t>
       </w:r>
       <w:r>
         <w:rPr>
@@ -1709,27 +1817,14 @@
         <w:t xml:space="preserve">after</w:t>
       </w:r>
       <w:r>
-        <w:t xml:space="preserve"> </w:t>
-      </w:r>
-      <w:r>
-        <w:t xml:space="preserve">rider score sheets (so its formulas reference sheets that already exist) and positioned</w:t>
-      </w:r>
-      <w:r>
-        <w:t xml:space="preserve"> </w:t>
+        <w:t xml:space="preserve"> rider score sheets (so its formulas reference sheets that already exist) and positioned </w:t>
       </w:r>
       <w:r>
         <w:rPr>
           <w:bCs/>
           <w:b/>
         </w:rPr>
-        <w:t xml:space="preserve">2nd from the left, right after</w:t>
-      </w:r>
-      <w:r>
-        <w:rPr>
-          <w:bCs/>
-          <w:b/>
-        </w:rPr>
-        <w:t xml:space="preserve"> </w:t>
+        <w:t xml:space="preserve">2nd from the left, right after </w:t>
       </w:r>
       <w:hyperlink w:anchor="leader-board">
         <w:r>
@@ -1742,13 +1837,7 @@
         </w:r>
       </w:hyperlink>
       <w:r>
-        <w:t xml:space="preserve"> </w:t>
-      </w:r>
-      <w:r>
-        <w:t xml:space="preserve">—</w:t>
-      </w:r>
-      <w:r>
-        <w:t xml:space="preserve"> </w:t>
+        <w:t xml:space="preserve"> — </w:t>
       </w:r>
       <w:r>
         <w:rPr>
@@ -1757,13 +1846,7 @@
         <w:t xml:space="preserve">setup()</w:t>
       </w:r>
       <w:r>
-        <w:t xml:space="preserve"> </w:t>
-      </w:r>
-      <w:r>
-        <w:t xml:space="preserve">explicitly moves it there once both exist, since Leader Board must be leftmost but can't be created until Master Scoring already exists. This only happens the first time either sheet is created; if you drag either tab elsewhere afterward, a later</w:t>
-      </w:r>
-      <w:r>
-        <w:t xml:space="preserve"> </w:t>
+        <w:t xml:space="preserve"> explicitly moves it there once both exist, since Leader Board must be leftmost but can't be created until Master Scoring already exists. This only happens the first time either sheet is created; if you drag either tab elsewhere afterward, a later </w:t>
       </w:r>
       <w:r>
         <w:rPr>
@@ -1772,10 +1855,7 @@
         <w:t xml:space="preserve">setup()</w:t>
       </w:r>
       <w:r>
-        <w:t xml:space="preserve"> </w:t>
-      </w:r>
-      <w:r>
-        <w:t xml:space="preserve">run won't move it back. A grid: one row per bonus (starting at row 5), one column per rider (starting at column C):</w:t>
+        <w:t xml:space="preserve"> run won't move it back. A grid: one row per bonus (starting at row 5), one column per rider (starting at column C):</w:t>
       </w:r>
     </w:p>
     <w:tbl>
@@ -2020,7 +2100,7 @@
               <w:rPr>
                 <w:rStyle w:val="VerbatimChar"/>
               </w:rPr>
-              <w:t xml:space="preserve">=SUMIF(C5:C,"X",$B5:$B)</w:t>
+              <w:t xml:space="preserve">=SUMIFS($B5:$B,C5:C,"X",$B5:$B,"&gt;0")*(1+MINIFS($B5:$B,C5:C,"X",$B5:$B,"&lt;0")/100)</w:t>
             </w:r>
           </w:p>
         </w:tc>
@@ -2171,10 +2251,7 @@
         <w:pStyle w:val="BodyText"/>
       </w:pPr>
       <w:r>
-        <w:t xml:space="preserve">Every formula is written directly by</w:t>
-      </w:r>
-      <w:r>
-        <w:t xml:space="preserve"> </w:t>
+        <w:t xml:space="preserve">Every formula is written directly by </w:t>
       </w:r>
       <w:r>
         <w:rPr>
@@ -2183,10 +2260,7 @@
         <w:t xml:space="preserve">setup()</w:t>
       </w:r>
       <w:r>
-        <w:t xml:space="preserve">, one per cell — not something you fill in by hand. Requires</w:t>
-      </w:r>
-      <w:r>
-        <w:t xml:space="preserve"> </w:t>
+        <w:t xml:space="preserve">, one per cell — not something you fill in by hand. Requires </w:t>
       </w:r>
       <w:r>
         <w:rPr>
@@ -2196,22 +2270,87 @@
         <w:t xml:space="preserve">Bonus Master</w:t>
       </w:r>
       <w:r>
+        <w:t xml:space="preserve"> to already exist (</w:t>
+      </w:r>
+      <w:r>
+        <w:rPr>
+          <w:rStyle w:val="VerbatimChar"/>
+        </w:rPr>
+        <w:t xml:space="preserve">setup()</w:t>
+      </w:r>
+      <w:r>
+        <w:t xml:space="preserve"> logs an error for this step and skips it otherwise, but still creates labels, rider sheets, and the trigger); tolerates Rider Master being missing/empty (nothing created, no error).</w:t>
+      </w:r>
+    </w:p>
+    <w:p>
+      <w:pPr>
+        <w:pStyle w:val="BodyText"/>
+      </w:pPr>
+      <w:r>
+        <w:rPr>
+          <w:rStyle w:val="VerbatimChar"/>
+        </w:rPr>
+        <w:t xml:space="preserve">Score</w:t>
+      </w:r>
+      <w:r>
+        <w:t xml:space="preserve"> sums every Approved bonus with a </w:t>
+      </w:r>
+      <w:r>
+        <w:rPr>
+          <w:iCs/>
+          <w:i/>
+        </w:rPr>
+        <w:t xml:space="preserve">positive</w:t>
+      </w:r>
+      <w:r>
         <w:t xml:space="preserve"> </w:t>
       </w:r>
       <w:r>
-        <w:t xml:space="preserve">to already exist (</w:t>
-      </w:r>
-      <w:r>
-        <w:rPr>
-          <w:rStyle w:val="VerbatimChar"/>
-        </w:rPr>
-        <w:t xml:space="preserve">setup()</w:t>
-      </w:r>
-      <w:r>
-        <w:t xml:space="preserve"> </w:t>
-      </w:r>
-      <w:r>
-        <w:t xml:space="preserve">logs an error for this step and skips it otherwise, but still creates labels, rider sheets, and the trigger); tolerates Rider Master being missing/empty (nothing created, no error).</w:t>
+        <w:rPr>
+          <w:rStyle w:val="VerbatimChar"/>
+        </w:rPr>
+        <w:t xml:space="preserve">POINTS</w:t>
+      </w:r>
+      <w:r>
+        <w:t xml:space="preserve"> value, then multiplies by </w:t>
+      </w:r>
+      <w:r>
+        <w:rPr>
+          <w:rStyle w:val="VerbatimChar"/>
+        </w:rPr>
+        <w:t xml:space="preserve">1 + (worst Approved penalty% / 100)</w:t>
+      </w:r>
+      <w:r>
+        <w:t xml:space="preserve"> — see the negative-</w:t>
+      </w:r>
+      <w:r>
+        <w:rPr>
+          <w:rStyle w:val="VerbatimChar"/>
+        </w:rPr>
+        <w:t xml:space="preserve">POINTS</w:t>
+      </w:r>
+      <w:r>
+        <w:t xml:space="preserve"> note in </w:t>
+      </w:r>
+      <w:hyperlink w:anchor="bonus-master">
+        <w:r>
+          <w:rPr>
+            <w:rStyle w:val="Hyperlink"/>
+          </w:rPr>
+          <w:t xml:space="preserve">Bonus Master</w:t>
+        </w:r>
+      </w:hyperlink>
+      <w:r>
+        <w:t xml:space="preserve"> above. Before any event uses a negative </w:t>
+      </w:r>
+      <w:r>
+        <w:rPr>
+          <w:rStyle w:val="VerbatimChar"/>
+        </w:rPr>
+        <w:t xml:space="preserve">POINTS</w:t>
+      </w:r>
+      <w:r>
+        <w:t xml:space="preserve"> value this is identical to a plain sum (nothing to multiply by but 1).</w:t>
       </w:r>
     </w:p>
     <w:p>
@@ -2234,10 +2373,7 @@
         <w:t xml:space="preserve">C:C</w:t>
       </w:r>
       <w:r>
-        <w:t xml:space="preserve">) would include row 3, the</w:t>
-      </w:r>
-      <w:r>
-        <w:t xml:space="preserve"> </w:t>
+        <w:t xml:space="preserve">) would include row 3, the </w:t>
       </w:r>
       <w:r>
         <w:rPr>
@@ -2246,10 +2382,7 @@
         <w:t xml:space="preserve">Score</w:t>
       </w:r>
       <w:r>
-        <w:t xml:space="preserve"> </w:t>
-      </w:r>
-      <w:r>
-        <w:t xml:space="preserve">formula's own cell, which Sheets rejects as a circular reference even though the criteria could never actually match it.</w:t>
+        <w:t xml:space="preserve"> formula's own cell, which Sheets rejects as a circular reference even though the criteria could never actually match it.</w:t>
       </w:r>
     </w:p>
     <w:p>
@@ -2261,42 +2394,73 @@
           <w:bCs/>
           <w:b/>
         </w:rPr>
-        <w:t xml:space="preserve">Re-running</w:t>
-      </w:r>
-      <w:r>
-        <w:rPr>
+        <w:t xml:space="preserve">Re-running </w:t>
+      </w:r>
+      <w:r>
+        <w:rPr>
+          <w:rStyle w:val="VerbatimChar"/>
           <w:bCs/>
           <w:b/>
         </w:rPr>
-        <w:t xml:space="preserve"> </w:t>
-      </w:r>
-      <w:r>
-        <w:rPr>
-          <w:rStyle w:val="VerbatimChar"/>
+        <w:t xml:space="preserve">setup()</w:t>
+      </w:r>
+      <w:r>
+        <w:rPr>
           <w:bCs/>
           <w:b/>
         </w:rPr>
-        <w:t xml:space="preserve">setup()</w:t>
-      </w:r>
+        <w:t xml:space="preserve"> grows this sheet</w:t>
+      </w:r>
+      <w:r>
+        <w:t xml:space="preserve"> as your roster and bonus list grow: a new rider gets a new column (backfilled for every existing bonus row), a new bonus gets a new row (backfilled for every existing rider column). Existing cells are never rewritten.</w:t>
+      </w:r>
+    </w:p>
+    <w:p>
+      <w:pPr>
+        <w:pStyle w:val="BodyText"/>
+      </w:pPr>
       <w:r>
         <w:rPr>
           <w:bCs/>
           <w:b/>
         </w:rPr>
-        <w:t xml:space="preserve"> </w:t>
-      </w:r>
+        <w:t xml:space="preserve">Formatting is reapplied over the whole sheet every run</w:t>
+      </w:r>
+      <w:r>
+        <w:t xml:space="preserve"> (not just newly-added rows/columns): every cell is center-aligned, the whole sheet gets alternating row colors ("banding"), and the data grid (row 5+, column C+) gets a conditional format rule that turns a cell green when it contains </w:t>
+      </w:r>
+      <w:r>
+        <w:rPr>
+          <w:rStyle w:val="VerbatimChar"/>
+        </w:rPr>
+        <w:t xml:space="preserve">X</w:t>
+      </w:r>
+      <w:r>
+        <w:t xml:space="preserve"> — i.e. whenever that rider is approved for that bonus. Growing the sheet on a later run redraws all three over the new, larger extent rather than leaving old rows/columns formatted differently from new ones.</w:t>
+      </w:r>
+    </w:p>
+    <w:p>
+      <w:pPr>
+        <w:pStyle w:val="BodyText"/>
+      </w:pPr>
       <w:r>
         <w:rPr>
           <w:bCs/>
           <w:b/>
         </w:rPr>
-        <w:t xml:space="preserve">grows this sheet</w:t>
-      </w:r>
-      <w:r>
-        <w:t xml:space="preserve"> </w:t>
-      </w:r>
-      <w:r>
-        <w:t xml:space="preserve">as your roster and bonus list grow: a new rider gets a new column (backfilled for every existing bonus row), a new bonus gets a new row (backfilled for every existing rider column). Existing cells are never rewritten.</w:t>
+        <w:t xml:space="preserve">The sheet is protected with "Edit with warning"</w:t>
+      </w:r>
+      <w:r>
+        <w:t xml:space="preserve"> the first time it's created — anyone can still edit any cell, but gets a confirmation dialog first, since the whole sheet is regenerated by </w:t>
+      </w:r>
+      <w:r>
+        <w:rPr>
+          <w:rStyle w:val="VerbatimChar"/>
+        </w:rPr>
+        <w:t xml:space="preserve">setup()</w:t>
+      </w:r>
+      <w:r>
+        <w:t xml:space="preserve">. This only happens once, at creation; a Master Scoring sheet that already existed before this was added doesn't get protection retroactively.</w:t>
       </w:r>
     </w:p>
     <w:p>
@@ -2308,77 +2472,7 @@
           <w:bCs/>
           <w:b/>
         </w:rPr>
-        <w:t xml:space="preserve">Formatting is reapplied over the whole sheet every run</w:t>
-      </w:r>
-      <w:r>
-        <w:t xml:space="preserve"> </w:t>
-      </w:r>
-      <w:r>
-        <w:t xml:space="preserve">(not just newly-added rows/columns): every cell is center-aligned, the whole sheet gets alternating row colors ("banding"), and the data grid (row 5+, column C+) gets a conditional format rule that turns a cell green when it contains</w:t>
-      </w:r>
-      <w:r>
-        <w:t xml:space="preserve"> </w:t>
-      </w:r>
-      <w:r>
-        <w:rPr>
-          <w:rStyle w:val="VerbatimChar"/>
-        </w:rPr>
-        <w:t xml:space="preserve">X</w:t>
-      </w:r>
-      <w:r>
-        <w:t xml:space="preserve"> </w:t>
-      </w:r>
-      <w:r>
-        <w:t xml:space="preserve">— i.e. whenever that rider is approved for that bonus. Growing the sheet on a later run redraws all three over the new, larger extent rather than leaving old rows/columns formatted differently from new ones.</w:t>
-      </w:r>
-    </w:p>
-    <w:p>
-      <w:pPr>
-        <w:pStyle w:val="BodyText"/>
-      </w:pPr>
-      <w:r>
-        <w:rPr>
-          <w:bCs/>
-          <w:b/>
-        </w:rPr>
-        <w:t xml:space="preserve">The sheet is protected with "Edit with warning"</w:t>
-      </w:r>
-      <w:r>
-        <w:t xml:space="preserve"> </w:t>
-      </w:r>
-      <w:r>
-        <w:t xml:space="preserve">the first time it's created — anyone can still edit any cell, but gets a confirmation dialog first, since the whole sheet is regenerated by</w:t>
-      </w:r>
-      <w:r>
-        <w:t xml:space="preserve"> </w:t>
-      </w:r>
-      <w:r>
-        <w:rPr>
-          <w:rStyle w:val="VerbatimChar"/>
-        </w:rPr>
-        <w:t xml:space="preserve">setup()</w:t>
-      </w:r>
-      <w:r>
-        <w:t xml:space="preserve">. This only happens once, at creation; a Master Scoring sheet that already existed before this was added doesn't get protection retroactively.</w:t>
-      </w:r>
-    </w:p>
-    <w:p>
-      <w:pPr>
-        <w:pStyle w:val="BodyText"/>
-      </w:pPr>
-      <w:r>
-        <w:rPr>
-          <w:bCs/>
-          <w:b/>
-        </w:rPr>
-        <w:t xml:space="preserve">A combo's own row (if you use</w:t>
-      </w:r>
-      <w:r>
-        <w:rPr>
-          <w:bCs/>
-          <w:b/>
-        </w:rPr>
-        <w:t xml:space="preserve"> </w:t>
+        <w:t xml:space="preserve">A combo's own row (if you use </w:t>
       </w:r>
       <w:hyperlink w:anchor="combo-master">
         <w:r>
@@ -2398,13 +2492,7 @@
         <w:t xml:space="preserve">) gets a different cell formula</w:t>
       </w:r>
       <w:r>
-        <w:t xml:space="preserve"> </w:t>
-      </w:r>
-      <w:r>
-        <w:t xml:space="preserve">than a regular bonus row:</w:t>
-      </w:r>
-      <w:r>
-        <w:t xml:space="preserve"> </w:t>
+        <w:t xml:space="preserve"> than a regular bonus row: </w:t>
       </w:r>
       <w:r>
         <w:rPr>
@@ -2413,13 +2501,7 @@
         <w:t xml:space="preserve">"X"</w:t>
       </w:r>
       <w:r>
-        <w:t xml:space="preserve"> </w:t>
-      </w:r>
-      <w:r>
-        <w:t xml:space="preserve">when</w:t>
-      </w:r>
-      <w:r>
-        <w:t xml:space="preserve"> </w:t>
+        <w:t xml:space="preserve"> when </w:t>
       </w:r>
       <w:r>
         <w:rPr>
@@ -2429,13 +2511,7 @@
         <w:t xml:space="preserve">either</w:t>
       </w:r>
       <w:r>
-        <w:t xml:space="preserve"> </w:t>
-      </w:r>
-      <w:r>
-        <w:t xml:space="preserve">every one of its member bonuses shows</w:t>
-      </w:r>
-      <w:r>
-        <w:t xml:space="preserve"> </w:t>
+        <w:t xml:space="preserve"> every one of its member bonuses shows </w:t>
       </w:r>
       <w:r>
         <w:rPr>
@@ -2444,13 +2520,7 @@
         <w:t xml:space="preserve">"X"</w:t>
       </w:r>
       <w:r>
-        <w:t xml:space="preserve"> </w:t>
-      </w:r>
-      <w:r>
-        <w:t xml:space="preserve">for that same rider,</w:t>
-      </w:r>
-      <w:r>
-        <w:t xml:space="preserve"> </w:t>
+        <w:t xml:space="preserve"> for that same rider, </w:t>
       </w:r>
       <w:r>
         <w:rPr>
@@ -2460,10 +2530,7 @@
         <w:t xml:space="preserve">or</w:t>
       </w:r>
       <w:r>
-        <w:t xml:space="preserve"> </w:t>
-      </w:r>
-      <w:r>
-        <w:t xml:space="preserve">the combo was itself directly approved via its own submission (the normal sidebar Approve button still works on a combo's own email exactly as before — this is additive, not a replacement). Like every other cell here, this is only computed when the cell is first written; a Combo Master mapping added after a combo's row/a rider's column already exists won't retroactively convert it.</w:t>
+        <w:t xml:space="preserve"> the combo was itself directly approved via its own submission (the normal sidebar Approve button still works on a combo's own email exactly as before — this is additive, not a replacement). Like every other cell here, this is only computed when the cell is first written; a Combo Master mapping added after a combo's row/a rider's column already exists won't retroactively convert it.</w:t>
       </w:r>
     </w:p>
     <w:bookmarkEnd w:id="29"/>
@@ -2481,10 +2548,7 @@
         <w:pStyle w:val="FirstParagraph"/>
       </w:pPr>
       <w:r>
-        <w:t xml:space="preserve">One tab per rider, named by their</w:t>
-      </w:r>
-      <w:r>
-        <w:t xml:space="preserve"> </w:t>
+        <w:t xml:space="preserve">One tab per rider, named by their </w:t>
       </w:r>
       <w:r>
         <w:rPr>
@@ -2494,13 +2558,7 @@
         <w:t xml:space="preserve">rider number</w:t>
       </w:r>
       <w:r>
-        <w:t xml:space="preserve"> </w:t>
-      </w:r>
-      <w:r>
-        <w:t xml:space="preserve">(e.g.</w:t>
-      </w:r>
-      <w:r>
-        <w:t xml:space="preserve"> </w:t>
+        <w:t xml:space="preserve"> (e.g. </w:t>
       </w:r>
       <w:r>
         <w:rPr>
@@ -2509,10 +2567,7 @@
         <w:t xml:space="preserve">42</w:t>
       </w:r>
       <w:r>
-        <w:t xml:space="preserve">). Created automatically by</w:t>
-      </w:r>
-      <w:r>
-        <w:t xml:space="preserve"> </w:t>
+        <w:t xml:space="preserve">). Created automatically by </w:t>
       </w:r>
       <w:r>
         <w:rPr>
@@ -2521,10 +2576,7 @@
         <w:t xml:space="preserve">setup()</w:t>
       </w:r>
       <w:r>
-        <w:t xml:space="preserve"> </w:t>
-      </w:r>
-      <w:r>
-        <w:t xml:space="preserve">for all riders in Rider Master, appended after existing tabs. Rider sheets are also created on-the-fly if a submission arrives for a rider without a sheet.</w:t>
+        <w:t xml:space="preserve"> for all riders in Rider Master, appended after existing tabs. Rider sheets are also created on-the-fly if a submission arrives for a rider without a sheet.</w:t>
       </w:r>
     </w:p>
     <w:p>
@@ -2740,10 +2792,7 @@
         <w:pStyle w:val="BodyText"/>
       </w:pPr>
       <w:r>
-        <w:t xml:space="preserve">Submit Time, Approve Time, and Deny Time (columns C, E, G) are formatted as</w:t>
-      </w:r>
-      <w:r>
-        <w:t xml:space="preserve"> </w:t>
+        <w:t xml:space="preserve">Submit Time, Approve Time, and Deny Time (columns C, E, G) are formatted as </w:t>
       </w:r>
       <w:r>
         <w:rPr>
@@ -2753,10 +2802,7 @@
         <w:t xml:space="preserve">Date + Time</w:t>
       </w:r>
       <w:r>
-        <w:t xml:space="preserve"> </w:t>
-      </w:r>
-      <w:r>
-        <w:t xml:space="preserve">(</w:t>
+        <w:t xml:space="preserve"> (</w:t>
       </w:r>
       <w:r>
         <w:rPr>
@@ -2765,10 +2811,7 @@
         <w:t xml:space="preserve">M/d/yyyy h:mm:ss am/pm</w:t>
       </w:r>
       <w:r>
-        <w:t xml:space="preserve">) at the moment the rider sheet is created, so a timestamp always displays with both — not just a date. This only applies going forward: a rider sheet that already existed before this was added, or a bonus row added to Bonus Master</w:t>
-      </w:r>
-      <w:r>
-        <w:t xml:space="preserve"> </w:t>
+        <w:t xml:space="preserve">) at the moment the rider sheet is created, so a timestamp always displays with both — not just a date. This only applies going forward: a rider sheet that already existed before this was added, or a bonus row added to Bonus Master </w:t>
       </w:r>
       <w:r>
         <w:rPr>
@@ -2778,10 +2821,7 @@
         <w:t xml:space="preserve">after</w:t>
       </w:r>
       <w:r>
-        <w:t xml:space="preserve"> </w:t>
-      </w:r>
-      <w:r>
-        <w:t xml:space="preserve">a rider's sheet was created, won't have the format applied automatically — reformat those columns by hand (select the column → Format → Number → Date time) if needed.</w:t>
+        <w:t xml:space="preserve"> a rider's sheet was created, won't have the format applied automatically — reformat those columns by hand (select the column → Format → Number → Date time) if needed.</w:t>
       </w:r>
     </w:p>
     <w:bookmarkEnd w:id="30"/>
@@ -2799,10 +2839,7 @@
         <w:pStyle w:val="FirstParagraph"/>
       </w:pPr>
       <w:r>
-        <w:t xml:space="preserve">A tab named</w:t>
-      </w:r>
-      <w:r>
-        <w:t xml:space="preserve"> </w:t>
+        <w:t xml:space="preserve">A tab named </w:t>
       </w:r>
       <w:r>
         <w:rPr>
@@ -2813,13 +2850,7 @@
         <w:t xml:space="preserve">Leader Board</w:t>
       </w:r>
       <w:r>
-        <w:t xml:space="preserve"> </w:t>
-      </w:r>
-      <w:r>
-        <w:t xml:space="preserve">(configurable via</w:t>
-      </w:r>
-      <w:r>
-        <w:t xml:space="preserve"> </w:t>
+        <w:t xml:space="preserve"> (configurable via </w:t>
       </w:r>
       <w:r>
         <w:rPr>
@@ -2828,10 +2859,7 @@
         <w:t xml:space="preserve">sheet_leader_board</w:t>
       </w:r>
       <w:r>
-        <w:t xml:space="preserve">), created by</w:t>
-      </w:r>
-      <w:r>
-        <w:t xml:space="preserve"> </w:t>
+        <w:t xml:space="preserve">), created by </w:t>
       </w:r>
       <w:r>
         <w:rPr>
@@ -2840,13 +2868,7 @@
         <w:t xml:space="preserve">setup()</w:t>
       </w:r>
       <w:r>
-        <w:t xml:space="preserve"> </w:t>
-      </w:r>
-      <w:r>
-        <w:t xml:space="preserve">as the</w:t>
-      </w:r>
-      <w:r>
-        <w:t xml:space="preserve"> </w:t>
+        <w:t xml:space="preserve"> as the </w:t>
       </w:r>
       <w:r>
         <w:rPr>
@@ -2856,10 +2878,7 @@
         <w:t xml:space="preserve">leftmost tab</w:t>
       </w:r>
       <w:r>
-        <w:t xml:space="preserve"> </w:t>
-      </w:r>
-      <w:r>
-        <w:t xml:space="preserve">in the workbook — one row per rider in Rider Master:</w:t>
+        <w:t xml:space="preserve"> in the workbook — one row per rider in Rider Master:</w:t>
       </w:r>
     </w:p>
     <w:tbl>
@@ -2995,10 +3014,7 @@
         <w:t xml:space="preserve">Rider Number</w:t>
       </w:r>
       <w:r>
-        <w:t xml:space="preserve"> </w:t>
-      </w:r>
-      <w:r>
-        <w:t xml:space="preserve">is a cell reference to Rider Master (not a copied value).</w:t>
+        <w:t xml:space="preserve"> is a cell reference to Rider Master (not a copied value).</w:t>
       </w:r>
     </w:p>
     <w:p>
@@ -3017,13 +3033,7 @@
         <w:t xml:space="preserve">Name</w:t>
       </w:r>
       <w:r>
-        <w:t xml:space="preserve"> </w:t>
-      </w:r>
-      <w:r>
-        <w:t xml:space="preserve">is a</w:t>
-      </w:r>
-      <w:r>
-        <w:t xml:space="preserve"> </w:t>
+        <w:t xml:space="preserve"> is a </w:t>
       </w:r>
       <w:r>
         <w:rPr>
@@ -3032,10 +3042,7 @@
         <w:t xml:space="preserve">VLOOKUP</w:t>
       </w:r>
       <w:r>
-        <w:t xml:space="preserve"> </w:t>
-      </w:r>
-      <w:r>
-        <w:t xml:space="preserve">against Rider Master.</w:t>
+        <w:t xml:space="preserve"> against Rider Master.</w:t>
       </w:r>
     </w:p>
     <w:p>
@@ -3054,13 +3061,7 @@
         <w:t xml:space="preserve">Score</w:t>
       </w:r>
       <w:r>
-        <w:t xml:space="preserve"> </w:t>
-      </w:r>
-      <w:r>
-        <w:t xml:space="preserve">is an</w:t>
-      </w:r>
-      <w:r>
-        <w:t xml:space="preserve"> </w:t>
+        <w:t xml:space="preserve"> is an </w:t>
       </w:r>
       <w:r>
         <w:rPr>
@@ -3069,13 +3070,7 @@
         <w:t xml:space="preserve">HLOOKUP</w:t>
       </w:r>
       <w:r>
-        <w:t xml:space="preserve"> </w:t>
-      </w:r>
-      <w:r>
-        <w:t xml:space="preserve">against</w:t>
-      </w:r>
-      <w:r>
-        <w:t xml:space="preserve"> </w:t>
+        <w:t xml:space="preserve"> against </w:t>
       </w:r>
       <w:hyperlink w:anchor="master-scoring">
         <w:r>
@@ -3086,10 +3081,7 @@
         </w:r>
       </w:hyperlink>
       <w:r>
-        <w:t xml:space="preserve">, which</w:t>
-      </w:r>
-      <w:r>
-        <w:t xml:space="preserve"> </w:t>
+        <w:t xml:space="preserve">, which </w:t>
       </w:r>
       <w:r>
         <w:rPr>
@@ -3098,13 +3090,7 @@
         <w:t xml:space="preserve">setup()</w:t>
       </w:r>
       <w:r>
-        <w:t xml:space="preserve"> </w:t>
-      </w:r>
-      <w:r>
-        <w:t xml:space="preserve">now creates automatically (right before Leader Board, specifically so it's already there) — you shouldn't normally hit the "must already exist" case at all any more; it only still applies if Bonus Master is</w:t>
-      </w:r>
-      <w:r>
-        <w:t xml:space="preserve"> </w:t>
+        <w:t xml:space="preserve"> now creates automatically (right before Leader Board, specifically so it's already there) — you shouldn't normally hit the "must already exist" case at all any more; it only still applies if Bonus Master is </w:t>
       </w:r>
       <w:r>
         <w:rPr>
@@ -3114,10 +3100,7 @@
         <w:t xml:space="preserve">also</w:t>
       </w:r>
       <w:r>
-        <w:t xml:space="preserve"> </w:t>
-      </w:r>
-      <w:r>
-        <w:t xml:space="preserve">missing, since that cascades into Master Scoring not being created either.</w:t>
+        <w:t xml:space="preserve"> missing, since that cascades into Master Scoring not being created either.</w:t>
       </w:r>
     </w:p>
     <w:p>
@@ -3136,10 +3119,7 @@
         <w:t xml:space="preserve">Finish</w:t>
       </w:r>
       <w:r>
-        <w:t xml:space="preserve"> </w:t>
-      </w:r>
-      <w:r>
-        <w:t xml:space="preserve">is the rider's rank by Score, highest first (rank 1 = highest score).</w:t>
+        <w:t xml:space="preserve"> is the rider's rank by Score, highest first (rank 1 = highest score).</w:t>
       </w:r>
     </w:p>
     <w:p>
@@ -3147,10 +3127,7 @@
         <w:pStyle w:val="FirstParagraph"/>
       </w:pPr>
       <w:r>
-        <w:t xml:space="preserve">Re-running</w:t>
-      </w:r>
-      <w:r>
-        <w:t xml:space="preserve"> </w:t>
+        <w:t xml:space="preserve">Re-running </w:t>
       </w:r>
       <w:r>
         <w:rPr>
@@ -3159,10 +3136,7 @@
         <w:t xml:space="preserve">setup()</w:t>
       </w:r>
       <w:r>
-        <w:t xml:space="preserve"> </w:t>
-      </w:r>
-      <w:r>
-        <w:t xml:space="preserve">adds a row for any rider newly added to Rider Master since the last run — existing rows are never rewritten. If you rename or restructure Master Scoring after Leader Board already has rows referencing it, those existing formulas keep pointing at the old range; only rows added afterward pick up the new layout.</w:t>
+        <w:t xml:space="preserve"> adds a row for any rider newly added to Rider Master since the last run — existing rows are never rewritten. If you rename or restructure Master Scoring after Leader Board already has rows referencing it, those existing formulas keep pointing at the old range; only rows added afterward pick up the new layout.</w:t>
       </w:r>
     </w:p>
     <w:p>
@@ -3188,10 +3162,7 @@
         <w:pStyle w:val="FirstParagraph"/>
       </w:pPr>
       <w:r>
-        <w:t xml:space="preserve">All labels are created automatically by</w:t>
-      </w:r>
-      <w:r>
-        <w:t xml:space="preserve"> </w:t>
+        <w:t xml:space="preserve">All labels are created automatically by </w:t>
       </w:r>
       <w:r>
         <w:rPr>
@@ -3200,10 +3171,7 @@
         <w:t xml:space="preserve">setup()</w:t>
       </w:r>
       <w:r>
-        <w:t xml:space="preserve">. The label prefix is configurable (default:</w:t>
-      </w:r>
-      <w:r>
-        <w:t xml:space="preserve"> </w:t>
+        <w:t xml:space="preserve">. The label prefix is configurable (default: </w:t>
       </w:r>
       <w:r>
         <w:rPr>
@@ -3548,10 +3516,7 @@
         <w:pStyle w:val="FirstParagraph"/>
       </w:pPr>
       <w:r>
-        <w:t xml:space="preserve">Create a new tab in your Google Sheet named exactly</w:t>
-      </w:r>
-      <w:r>
-        <w:t xml:space="preserve"> </w:t>
+        <w:t xml:space="preserve">Create a new tab in your Google Sheet named exactly </w:t>
       </w:r>
       <w:r>
         <w:rPr>
@@ -3560,10 +3525,7 @@
         <w:t xml:space="preserve">Config</w:t>
       </w:r>
       <w:r>
-        <w:t xml:space="preserve">. Add the following columns in row 1:</w:t>
-      </w:r>
-      <w:r>
-        <w:t xml:space="preserve"> </w:t>
+        <w:t xml:space="preserve">. Add the following columns in row 1: </w:t>
       </w:r>
       <w:r>
         <w:rPr>
@@ -3572,10 +3534,7 @@
         <w:t xml:space="preserve">key</w:t>
       </w:r>
       <w:r>
-        <w:t xml:space="preserve">,</w:t>
-      </w:r>
-      <w:r>
-        <w:t xml:space="preserve"> </w:t>
+        <w:t xml:space="preserve">, </w:t>
       </w:r>
       <w:r>
         <w:rPr>
@@ -3584,10 +3543,7 @@
         <w:t xml:space="preserve">value</w:t>
       </w:r>
       <w:r>
-        <w:t xml:space="preserve">,</w:t>
-      </w:r>
-      <w:r>
-        <w:t xml:space="preserve"> </w:t>
+        <w:t xml:space="preserve">, </w:t>
       </w:r>
       <w:r>
         <w:rPr>
@@ -3596,10 +3552,7 @@
         <w:t xml:space="preserve">notes</w:t>
       </w:r>
       <w:r>
-        <w:t xml:space="preserve">. Then populate it using the</w:t>
-      </w:r>
-      <w:r>
-        <w:t xml:space="preserve"> </w:t>
+        <w:t xml:space="preserve">. Then populate it using the </w:t>
       </w:r>
       <w:hyperlink w:anchor="config-sheet-reference">
         <w:r>
@@ -3610,10 +3563,7 @@
         </w:r>
       </w:hyperlink>
       <w:r>
-        <w:t xml:space="preserve"> </w:t>
-      </w:r>
-      <w:r>
-        <w:t xml:space="preserve">below — one row per key.</w:t>
+        <w:t xml:space="preserve"> below — one row per key.</w:t>
       </w:r>
     </w:p>
     <w:p>
@@ -3627,13 +3577,7 @@
         <w:t xml:space="preserve">setup()</w:t>
       </w:r>
       <w:r>
-        <w:t xml:space="preserve"> </w:t>
-      </w:r>
-      <w:r>
-        <w:t xml:space="preserve">will automatically fill in the</w:t>
-      </w:r>
-      <w:r>
-        <w:t xml:space="preserve"> </w:t>
+        <w:t xml:space="preserve"> will automatically fill in the </w:t>
       </w:r>
       <w:r>
         <w:rPr>
@@ -3642,10 +3586,7 @@
         <w:t xml:space="preserve">spreadsheet_id</w:t>
       </w:r>
       <w:r>
-        <w:t xml:space="preserve"> </w:t>
-      </w:r>
-      <w:r>
-        <w:t xml:space="preserve">value when it runs, so you can leave that blank.</w:t>
+        <w:t xml:space="preserve"> value when it runs, so you can leave that blank.</w:t>
       </w:r>
     </w:p>
     <w:bookmarkEnd w:id="34"/>
@@ -3667,10 +3608,7 @@
         <w:pStyle w:val="Compact"/>
       </w:pPr>
       <w:r>
-        <w:t xml:space="preserve">Open your Google Sheet →</w:t>
-      </w:r>
-      <w:r>
-        <w:t xml:space="preserve"> </w:t>
+        <w:t xml:space="preserve">Open your Google Sheet → </w:t>
       </w:r>
       <w:r>
         <w:rPr>
@@ -3689,10 +3627,7 @@
         <w:pStyle w:val="Compact"/>
       </w:pPr>
       <w:r>
-        <w:t xml:space="preserve">Paste</w:t>
-      </w:r>
-      <w:r>
-        <w:t xml:space="preserve"> </w:t>
+        <w:t xml:space="preserve">Paste </w:t>
       </w:r>
       <w:r>
         <w:rPr>
@@ -3701,13 +3636,7 @@
         <w:t xml:space="preserve">code.js</w:t>
       </w:r>
       <w:r>
-        <w:t xml:space="preserve"> </w:t>
-      </w:r>
-      <w:r>
-        <w:t xml:space="preserve">into</w:t>
-      </w:r>
-      <w:r>
-        <w:t xml:space="preserve"> </w:t>
+        <w:t xml:space="preserve"> into </w:t>
       </w:r>
       <w:r>
         <w:rPr>
@@ -3725,10 +3654,7 @@
         <w:pStyle w:val="Compact"/>
       </w:pPr>
       <w:r>
-        <w:t xml:space="preserve">Click</w:t>
-      </w:r>
-      <w:r>
-        <w:t xml:space="preserve"> </w:t>
+        <w:t xml:space="preserve">Click </w:t>
       </w:r>
       <w:r>
         <w:rPr>
@@ -3738,13 +3664,7 @@
         <w:t xml:space="preserve">+</w:t>
       </w:r>
       <w:r>
-        <w:t xml:space="preserve"> </w:t>
-      </w:r>
-      <w:r>
-        <w:t xml:space="preserve">next to Files → New script → name it</w:t>
-      </w:r>
-      <w:r>
-        <w:t xml:space="preserve"> </w:t>
+        <w:t xml:space="preserve"> next to Files → New script → name it </w:t>
       </w:r>
       <w:r>
         <w:rPr>
@@ -3753,13 +3673,7 @@
         <w:t xml:space="preserve">Sidebar</w:t>
       </w:r>
       <w:r>
-        <w:t xml:space="preserve"> </w:t>
-      </w:r>
-      <w:r>
-        <w:t xml:space="preserve">→ paste</w:t>
-      </w:r>
-      <w:r>
-        <w:t xml:space="preserve"> </w:t>
+        <w:t xml:space="preserve"> → paste </w:t>
       </w:r>
       <w:r>
         <w:rPr>
@@ -3784,13 +3698,7 @@
         <w:t xml:space="preserve">(Optional, for testing)</w:t>
       </w:r>
       <w:r>
-        <w:t xml:space="preserve"> </w:t>
-      </w:r>
-      <w:r>
-        <w:t xml:space="preserve">Click</w:t>
-      </w:r>
-      <w:r>
-        <w:t xml:space="preserve"> </w:t>
+        <w:t xml:space="preserve"> Click </w:t>
       </w:r>
       <w:r>
         <w:rPr>
@@ -3800,13 +3708,7 @@
         <w:t xml:space="preserve">+</w:t>
       </w:r>
       <w:r>
-        <w:t xml:space="preserve"> </w:t>
-      </w:r>
-      <w:r>
-        <w:t xml:space="preserve">next to Files → New script → name it</w:t>
-      </w:r>
-      <w:r>
-        <w:t xml:space="preserve"> </w:t>
+        <w:t xml:space="preserve"> next to Files → New script → name it </w:t>
       </w:r>
       <w:r>
         <w:rPr>
@@ -3815,13 +3717,7 @@
         <w:t xml:space="preserve">Utility</w:t>
       </w:r>
       <w:r>
-        <w:t xml:space="preserve"> </w:t>
-      </w:r>
-      <w:r>
-        <w:t xml:space="preserve">→ paste</w:t>
-      </w:r>
-      <w:r>
-        <w:t xml:space="preserve"> </w:t>
+        <w:t xml:space="preserve"> → paste </w:t>
       </w:r>
       <w:r>
         <w:rPr>
@@ -3830,13 +3726,7 @@
         <w:t xml:space="preserve">utility.js</w:t>
       </w:r>
       <w:r>
-        <w:t xml:space="preserve"> </w:t>
-      </w:r>
-      <w:r>
-        <w:t xml:space="preserve">— see</w:t>
-      </w:r>
-      <w:r>
-        <w:t xml:space="preserve"> </w:t>
+        <w:t xml:space="preserve"> — see </w:t>
       </w:r>
       <w:hyperlink w:anchor="utility-scripts">
         <w:r>
@@ -3856,10 +3746,7 @@
         <w:pStyle w:val="Compact"/>
       </w:pPr>
       <w:r>
-        <w:t xml:space="preserve">Project Settings → check</w:t>
-      </w:r>
-      <w:r>
-        <w:t xml:space="preserve"> </w:t>
+        <w:t xml:space="preserve">Project Settings → check </w:t>
       </w:r>
       <w:r>
         <w:rPr>
@@ -3869,13 +3756,7 @@
         <w:t xml:space="preserve">Show "appsscript.json" manifest file in editor</w:t>
       </w:r>
       <w:r>
-        <w:t xml:space="preserve"> </w:t>
-      </w:r>
-      <w:r>
-        <w:t xml:space="preserve">→ paste</w:t>
-      </w:r>
-      <w:r>
-        <w:t xml:space="preserve"> </w:t>
+        <w:t xml:space="preserve"> → paste </w:t>
       </w:r>
       <w:r>
         <w:rPr>
@@ -3923,10 +3804,7 @@
         <w:pStyle w:val="Compact"/>
       </w:pPr>
       <w:r>
-        <w:t xml:space="preserve">Select function</w:t>
-      </w:r>
-      <w:r>
-        <w:t xml:space="preserve"> </w:t>
+        <w:t xml:space="preserve">Select function </w:t>
       </w:r>
       <w:r>
         <w:rPr>
@@ -3935,10 +3813,7 @@
         <w:t xml:space="preserve">setup</w:t>
       </w:r>
       <w:r>
-        <w:t xml:space="preserve"> </w:t>
-      </w:r>
-      <w:r>
-        <w:t xml:space="preserve">from the dropdown</w:t>
+        <w:t xml:space="preserve"> from the dropdown</w:t>
       </w:r>
     </w:p>
     <w:p>
@@ -3950,10 +3825,7 @@
         <w:pStyle w:val="Compact"/>
       </w:pPr>
       <w:r>
-        <w:t xml:space="preserve">Click</w:t>
-      </w:r>
-      <w:r>
-        <w:t xml:space="preserve"> </w:t>
+        <w:t xml:space="preserve">Click </w:t>
       </w:r>
       <w:r>
         <w:rPr>
@@ -3986,10 +3858,7 @@
         <w:t xml:space="preserve">setup()</w:t>
       </w:r>
       <w:r>
-        <w:t xml:space="preserve"> </w:t>
-      </w:r>
-      <w:r>
-        <w:t xml:space="preserve">will:</w:t>
+        <w:t xml:space="preserve"> will:</w:t>
       </w:r>
     </w:p>
     <w:p>
@@ -4013,10 +3882,7 @@
         <w:pStyle w:val="Compact"/>
       </w:pPr>
       <w:r>
-        <w:t xml:space="preserve">Create the bare</w:t>
-      </w:r>
-      <w:r>
-        <w:t xml:space="preserve"> </w:t>
+        <w:t xml:space="preserve">Create the bare </w:t>
       </w:r>
       <w:r>
         <w:rPr>
@@ -4025,10 +3891,7 @@
         <w:t xml:space="preserve">rally</w:t>
       </w:r>
       <w:r>
-        <w:t xml:space="preserve"> </w:t>
-      </w:r>
-      <w:r>
-        <w:t xml:space="preserve">parent label and all sub-labels</w:t>
+        <w:t xml:space="preserve"> parent label and all sub-labels</w:t>
       </w:r>
     </w:p>
     <w:p>
@@ -4064,10 +3927,7 @@
         <w:pStyle w:val="Compact"/>
       </w:pPr>
       <w:r>
-        <w:t xml:space="preserve">Create or grow the</w:t>
-      </w:r>
-      <w:r>
-        <w:t xml:space="preserve"> </w:t>
+        <w:t xml:space="preserve">Create or grow the </w:t>
       </w:r>
       <w:hyperlink w:anchor="master-scoring">
         <w:r>
@@ -4078,13 +3938,7 @@
         </w:r>
       </w:hyperlink>
       <w:r>
-        <w:t xml:space="preserve"> </w:t>
-      </w:r>
-      <w:r>
-        <w:t xml:space="preserve">sheet (skipped, with a logged error, if</w:t>
-      </w:r>
-      <w:r>
-        <w:t xml:space="preserve"> </w:t>
+        <w:t xml:space="preserve"> sheet (skipped, with a logged error, if </w:t>
       </w:r>
       <w:r>
         <w:rPr>
@@ -4093,10 +3947,7 @@
         <w:t xml:space="preserve">Bonus Master</w:t>
       </w:r>
       <w:r>
-        <w:t xml:space="preserve"> </w:t>
-      </w:r>
-      <w:r>
-        <w:t xml:space="preserve">doesn't exist yet — everything else above/below still runs)</w:t>
+        <w:t xml:space="preserve"> doesn't exist yet — everything else above/below still runs)</w:t>
       </w:r>
     </w:p>
     <w:p>
@@ -4108,10 +3959,7 @@
         <w:pStyle w:val="Compact"/>
       </w:pPr>
       <w:r>
-        <w:t xml:space="preserve">Create or update the</w:t>
-      </w:r>
-      <w:r>
-        <w:t xml:space="preserve"> </w:t>
+        <w:t xml:space="preserve">Create or update the </w:t>
       </w:r>
       <w:hyperlink w:anchor="leader-board">
         <w:r>
@@ -4122,13 +3970,7 @@
         </w:r>
       </w:hyperlink>
       <w:r>
-        <w:t xml:space="preserve"> </w:t>
-      </w:r>
-      <w:r>
-        <w:t xml:space="preserve">sheet (skipped, with a logged error, if</w:t>
-      </w:r>
-      <w:r>
-        <w:t xml:space="preserve"> </w:t>
+        <w:t xml:space="preserve"> sheet (skipped, with a logged error, if </w:t>
       </w:r>
       <w:r>
         <w:rPr>
@@ -4137,13 +3979,7 @@
         <w:t xml:space="preserve">Master Scoring</w:t>
       </w:r>
       <w:r>
-        <w:t xml:space="preserve"> </w:t>
-      </w:r>
-      <w:r>
-        <w:t xml:space="preserve">doesn't exist — which itself only happens if</w:t>
-      </w:r>
-      <w:r>
-        <w:t xml:space="preserve"> </w:t>
+        <w:t xml:space="preserve"> doesn't exist — which itself only happens if </w:t>
       </w:r>
       <w:r>
         <w:rPr>
@@ -4152,10 +3988,7 @@
         <w:t xml:space="preserve">Bonus Master</w:t>
       </w:r>
       <w:r>
-        <w:t xml:space="preserve"> </w:t>
-      </w:r>
-      <w:r>
-        <w:t xml:space="preserve">was also missing)</w:t>
+        <w:t xml:space="preserve"> was also missing)</w:t>
       </w:r>
     </w:p>
     <w:p>
@@ -4201,10 +4034,7 @@
         <w:pStyle w:val="Compact"/>
       </w:pPr>
       <w:r>
-        <w:t xml:space="preserve">In Apps Script →</w:t>
-      </w:r>
-      <w:r>
-        <w:t xml:space="preserve"> </w:t>
+        <w:t xml:space="preserve">In Apps Script → </w:t>
       </w:r>
       <w:r>
         <w:rPr>
@@ -4223,10 +4053,7 @@
         <w:pStyle w:val="Compact"/>
       </w:pPr>
       <w:r>
-        <w:t xml:space="preserve">Click</w:t>
-      </w:r>
-      <w:r>
-        <w:t xml:space="preserve"> </w:t>
+        <w:t xml:space="preserve">Click </w:t>
       </w:r>
       <w:r>
         <w:rPr>
@@ -4245,10 +4072,7 @@
         <w:pStyle w:val="Compact"/>
       </w:pPr>
       <w:r>
-        <w:t xml:space="preserve">Open Gmail — the</w:t>
-      </w:r>
-      <w:r>
-        <w:t xml:space="preserve"> </w:t>
+        <w:t xml:space="preserve">Open Gmail — the </w:t>
       </w:r>
       <w:r>
         <w:rPr>
@@ -4258,10 +4082,7 @@
         <w:t xml:space="preserve">Rally Scoring</w:t>
       </w:r>
       <w:r>
-        <w:t xml:space="preserve"> </w:t>
-      </w:r>
-      <w:r>
-        <w:t xml:space="preserve">panel will appear on the right when you open any submission email</w:t>
+        <w:t xml:space="preserve"> panel will appear on the right when you open any submission email</w:t>
       </w:r>
     </w:p>
     <w:bookmarkEnd w:id="37"/>
@@ -4291,10 +4112,7 @@
         <w:pStyle w:val="Compact"/>
       </w:pPr>
       <w:r>
-        <w:t xml:space="preserve">In Gmail → Settings →</w:t>
-      </w:r>
-      <w:r>
-        <w:t xml:space="preserve"> </w:t>
+        <w:t xml:space="preserve">In Gmail → Settings → </w:t>
       </w:r>
       <w:r>
         <w:rPr>
@@ -4313,10 +4131,7 @@
         <w:pStyle w:val="Compact"/>
       </w:pPr>
       <w:r>
-        <w:t xml:space="preserve">In the</w:t>
-      </w:r>
-      <w:r>
-        <w:t xml:space="preserve"> </w:t>
+        <w:t xml:space="preserve">In the </w:t>
       </w:r>
       <w:r>
         <w:rPr>
@@ -4326,10 +4141,7 @@
         <w:t xml:space="preserve">To</w:t>
       </w:r>
       <w:r>
-        <w:t xml:space="preserve"> </w:t>
-      </w:r>
-      <w:r>
-        <w:t xml:space="preserve">field, enter your scoring email address</w:t>
+        <w:t xml:space="preserve"> field, enter your scoring email address</w:t>
       </w:r>
     </w:p>
     <w:p>
@@ -4341,10 +4153,7 @@
         <w:pStyle w:val="Compact"/>
       </w:pPr>
       <w:r>
-        <w:t xml:space="preserve">Click</w:t>
-      </w:r>
-      <w:r>
-        <w:t xml:space="preserve"> </w:t>
+        <w:t xml:space="preserve">Click </w:t>
       </w:r>
       <w:r>
         <w:rPr>
@@ -4363,10 +4172,7 @@
         <w:pStyle w:val="Compact"/>
       </w:pPr>
       <w:r>
-        <w:t xml:space="preserve">Check</w:t>
-      </w:r>
-      <w:r>
-        <w:t xml:space="preserve"> </w:t>
+        <w:t xml:space="preserve">Check </w:t>
       </w:r>
       <w:r>
         <w:rPr>
@@ -4376,13 +4182,7 @@
         <w:t xml:space="preserve">Apply the label</w:t>
       </w:r>
       <w:r>
-        <w:t xml:space="preserve"> </w:t>
-      </w:r>
-      <w:r>
-        <w:t xml:space="preserve">→ select</w:t>
-      </w:r>
-      <w:r>
-        <w:t xml:space="preserve"> </w:t>
+        <w:t xml:space="preserve"> → select </w:t>
       </w:r>
       <w:r>
         <w:rPr>
@@ -4462,13 +4262,7 @@
         <w:t xml:space="preserve">Approve this bonus</w:t>
       </w:r>
       <w:r>
-        <w:t xml:space="preserve"> </w:t>
-      </w:r>
-      <w:r>
-        <w:t xml:space="preserve">— writes X + timestamp to the Approved column immediately and marks the thread</w:t>
-      </w:r>
-      <w:r>
-        <w:t xml:space="preserve"> </w:t>
+        <w:t xml:space="preserve"> — writes X + timestamp to the Approved column immediately and marks the thread </w:t>
       </w:r>
       <w:r>
         <w:rPr>
@@ -4493,13 +4287,7 @@
         <w:t xml:space="preserve">Deny this bonus</w:t>
       </w:r>
       <w:r>
-        <w:t xml:space="preserve"> </w:t>
-      </w:r>
-      <w:r>
-        <w:t xml:space="preserve">— writes X + timestamp to the Denied column immediately and marks the thread</w:t>
-      </w:r>
-      <w:r>
-        <w:t xml:space="preserve"> </w:t>
+        <w:t xml:space="preserve"> — writes X + timestamp to the Denied column immediately and marks the thread </w:t>
       </w:r>
       <w:r>
         <w:rPr>
@@ -4542,13 +4330,7 @@
         <w:t xml:space="preserve">Remove approval / revert to email-requires-review</w:t>
       </w:r>
       <w:r>
-        <w:t xml:space="preserve"> </w:t>
-      </w:r>
-      <w:r>
-        <w:t xml:space="preserve">— clears the Approved column in the sheet and moves the thread back to</w:t>
-      </w:r>
-      <w:r>
-        <w:t xml:space="preserve"> </w:t>
+        <w:t xml:space="preserve"> — clears the Approved column in the sheet and moves the thread back to </w:t>
       </w:r>
       <w:r>
         <w:rPr>
@@ -4573,13 +4355,7 @@
         <w:t xml:space="preserve">Remove denial / revert to email-requires-review</w:t>
       </w:r>
       <w:r>
-        <w:t xml:space="preserve"> </w:t>
-      </w:r>
-      <w:r>
-        <w:t xml:space="preserve">— clears the Denied column in the sheet and moves the thread back to</w:t>
-      </w:r>
-      <w:r>
-        <w:t xml:space="preserve"> </w:t>
+        <w:t xml:space="preserve"> — clears the Denied column in the sheet and moves the thread back to </w:t>
       </w:r>
       <w:r>
         <w:rPr>
@@ -4700,10 +4476,7 @@
         <w:pStyle w:val="Compact"/>
       </w:pPr>
       <w:r>
-        <w:t xml:space="preserve">Bonus code is either exactly 4 alphabetic characters (e.g.</w:t>
-      </w:r>
-      <w:r>
-        <w:t xml:space="preserve"> </w:t>
+        <w:t xml:space="preserve">Bonus code is either exactly 4 alphabetic characters (e.g. </w:t>
       </w:r>
       <w:r>
         <w:rPr>
@@ -4712,10 +4485,7 @@
         <w:t xml:space="preserve">ABCD</w:t>
       </w:r>
       <w:r>
-        <w:t xml:space="preserve">), or exactly 3 alphabetic characters followed by exactly 1 digit (e.g.</w:t>
-      </w:r>
-      <w:r>
-        <w:t xml:space="preserve"> </w:t>
+        <w:t xml:space="preserve">), or exactly 3 alphabetic characters followed by exactly 1 digit (e.g. </w:t>
       </w:r>
       <w:r>
         <w:rPr>
@@ -4785,10 +4555,7 @@
         <w:pStyle w:val="FirstParagraph"/>
       </w:pPr>
       <w:r>
-        <w:t xml:space="preserve">A</w:t>
-      </w:r>
-      <w:r>
-        <w:t xml:space="preserve"> </w:t>
+        <w:t xml:space="preserve">A </w:t>
       </w:r>
       <w:r>
         <w:rPr>
@@ -4798,13 +4565,7 @@
         <w:t xml:space="preserve">combination bonus</w:t>
       </w:r>
       <w:r>
-        <w:t xml:space="preserve"> </w:t>
-      </w:r>
-      <w:r>
-        <w:t xml:space="preserve">(or "combo") bundles several regular bonuses under one code — for example, a bonus that only counts once a rider has also claimed a specific set of other bonuses. Add its code to</w:t>
-      </w:r>
-      <w:r>
-        <w:t xml:space="preserve"> </w:t>
+        <w:t xml:space="preserve"> (or "combo") bundles several regular bonuses under one code — for example, a bonus that only counts once a rider has also claimed a specific set of other bonuses. Add its code to </w:t>
       </w:r>
       <w:r>
         <w:rPr>
@@ -4814,13 +4575,7 @@
         <w:t xml:space="preserve">Bonus Master</w:t>
       </w:r>
       <w:r>
-        <w:t xml:space="preserve"> </w:t>
-      </w:r>
-      <w:r>
-        <w:t xml:space="preserve">exactly like any other bonus. A rider claims it exactly like a regular bonus too — same</w:t>
-      </w:r>
-      <w:r>
-        <w:t xml:space="preserve"> </w:t>
+        <w:t xml:space="preserve"> exactly like any other bonus. A rider claims it exactly like a regular bonus too — same </w:t>
       </w:r>
       <w:r>
         <w:rPr>
@@ -4829,13 +4584,7 @@
         <w:t xml:space="preserve">&lt;Rider#&gt; &lt;code&gt;</w:t>
       </w:r>
       <w:r>
-        <w:t xml:space="preserve"> </w:t>
-      </w:r>
-      <w:r>
-        <w:t xml:space="preserve">subject format (see</w:t>
-      </w:r>
-      <w:r>
-        <w:t xml:space="preserve"> </w:t>
+        <w:t xml:space="preserve"> subject format (see </w:t>
       </w:r>
       <w:hyperlink w:anchor="submission-format">
         <w:r>
@@ -4846,10 +4595,7 @@
         </w:r>
       </w:hyperlink>
       <w:r>
-        <w:t xml:space="preserve">),</w:t>
-      </w:r>
-      <w:r>
-        <w:t xml:space="preserve"> </w:t>
+        <w:t xml:space="preserve">), </w:t>
       </w:r>
       <w:r>
         <w:rPr>
@@ -4859,10 +4605,7 @@
         <w:t xml:space="preserve">no photo required</w:t>
       </w:r>
       <w:r>
-        <w:t xml:space="preserve"> </w:t>
-      </w:r>
-      <w:r>
-        <w:t xml:space="preserve">for the combo email itself (the script never checks for photo attachments on any submission, so this is just a note for riders, not a code difference).</w:t>
+        <w:t xml:space="preserve"> for the combo email itself (the script never checks for photo attachments on any submission, so this is just a note for riders, not a code difference).</w:t>
       </w:r>
     </w:p>
     <w:p>
@@ -4877,10 +4620,7 @@
         <w:t xml:space="preserve">The sidebar has no idea a combo is a combo.</w:t>
       </w:r>
       <w:r>
-        <w:t xml:space="preserve"> </w:t>
-      </w:r>
-      <w:r>
-        <w:t xml:space="preserve">Submitting, approving, and denying a combo's own email goes through the exact same mechanism as any bonus — the sidebar shows the same Approve/Deny buttons it would for anything else, with no gate and no reminder about dependencies. A scorer can always approve a combo's own submission directly, on its own merits, exactly as before.</w:t>
+        <w:t xml:space="preserve"> Submitting, approving, and denying a combo's own email goes through the exact same mechanism as any bonus — the sidebar shows the same Approve/Deny buttons it would for anything else, with no gate and no reminder about dependencies. A scorer can always approve a combo's own submission directly, on its own merits, exactly as before.</w:t>
       </w:r>
     </w:p>
     <w:p>
@@ -4895,10 +4635,7 @@
         <w:t xml:space="preserve">Master Scoring can auto-approve a combo for you, though</w:t>
       </w:r>
       <w:r>
-        <w:t xml:space="preserve">, if you set up the optional</w:t>
-      </w:r>
-      <w:r>
-        <w:t xml:space="preserve"> </w:t>
+        <w:t xml:space="preserve">, if you set up the optional </w:t>
       </w:r>
       <w:hyperlink w:anchor="combo-master">
         <w:r>
@@ -4909,13 +4646,7 @@
         </w:r>
       </w:hyperlink>
       <w:r>
-        <w:t xml:space="preserve"> </w:t>
-      </w:r>
-      <w:r>
-        <w:t xml:space="preserve">sheet listing which bonuses a combo depends on — once every one of those is approved for a rider, that rider's cell for the combo in Master Scoring reads</w:t>
-      </w:r>
-      <w:r>
-        <w:t xml:space="preserve"> </w:t>
+        <w:t xml:space="preserve"> sheet listing which bonuses a combo depends on — once every one of those is approved for a rider, that rider's cell for the combo in Master Scoring reads </w:t>
       </w:r>
       <w:r>
         <w:rPr>
@@ -4924,10 +4655,7 @@
         <w:t xml:space="preserve">"X"</w:t>
       </w:r>
       <w:r>
-        <w:t xml:space="preserve"> </w:t>
-      </w:r>
-      <w:r>
-        <w:t xml:space="preserve">automatically, counting the combo's points toward their Score with no action needed on the combo's own submission. This lives entirely in Master Scoring's generated formulas — it doesn't move any Gmail label, write any timestamp, or touch the rider sheet's own Approved column, and a scorer directly approving the combo's own email still works too (either path is enough on its own).</w:t>
+        <w:t xml:space="preserve"> automatically, counting the combo's points toward their Score with no action needed on the combo's own submission. This lives entirely in Master Scoring's generated formulas — it doesn't move any Gmail label, write any timestamp, or touch the rider sheet's own Approved column, and a scorer directly approving the combo's own email still works too (either path is enough on its own).</w:t>
       </w:r>
     </w:p>
     <w:p>
@@ -5122,10 +4850,7 @@
               <w:jc w:val="left"/>
             </w:pPr>
             <w:r>
-              <w:t xml:space="preserve">Written automatically by</w:t>
-            </w:r>
-            <w:r>
-              <w:t xml:space="preserve"> </w:t>
+              <w:t xml:space="preserve">Written automatically by </w:t>
             </w:r>
             <w:r>
               <w:rPr>
@@ -5134,10 +4859,7 @@
               <w:t xml:space="preserve">setup()</w:t>
             </w:r>
             <w:r>
-              <w:t xml:space="preserve"> </w:t>
-            </w:r>
-            <w:r>
-              <w:t xml:space="preserve">— do not change</w:t>
+              <w:t xml:space="preserve"> — do not change</w:t>
             </w:r>
           </w:p>
         </w:tc>
@@ -5269,10 +4991,7 @@
               <w:jc w:val="left"/>
             </w:pPr>
             <w:r>
-              <w:t xml:space="preserve">Tab name for</w:t>
-            </w:r>
-            <w:r>
-              <w:t xml:space="preserve"> </w:t>
+              <w:t xml:space="preserve">Tab name for </w:t>
             </w:r>
             <w:hyperlink w:anchor="combo-master">
               <w:r>
@@ -5283,10 +5002,7 @@
               </w:r>
             </w:hyperlink>
             <w:r>
-              <w:t xml:space="preserve"> </w:t>
-            </w:r>
-            <w:r>
-              <w:t xml:space="preserve">- optional</w:t>
+              <w:t xml:space="preserve"> - optional</w:t>
             </w:r>
           </w:p>
         </w:tc>
@@ -5330,10 +5046,7 @@
               <w:jc w:val="left"/>
             </w:pPr>
             <w:r>
-              <w:t xml:space="preserve">Tab name for</w:t>
-            </w:r>
-            <w:r>
-              <w:t xml:space="preserve"> </w:t>
+              <w:t xml:space="preserve">Tab name for </w:t>
             </w:r>
             <w:hyperlink w:anchor="master-scoring">
               <w:r>
@@ -5388,10 +5101,7 @@
               <w:jc w:val="left"/>
             </w:pPr>
             <w:r>
-              <w:t xml:space="preserve">Tab name for the</w:t>
-            </w:r>
-            <w:r>
-              <w:t xml:space="preserve"> </w:t>
+              <w:t xml:space="preserve">Tab name for the </w:t>
             </w:r>
             <w:hyperlink w:anchor="leader-board">
               <w:r>
@@ -5883,10 +5593,7 @@
               <w:jc w:val="left"/>
             </w:pPr>
             <w:r>
-              <w:t xml:space="preserve">Re-run</w:t>
-            </w:r>
-            <w:r>
-              <w:t xml:space="preserve"> </w:t>
+              <w:t xml:space="preserve">Re-run </w:t>
             </w:r>
             <w:r>
               <w:rPr>
@@ -5895,10 +5602,7 @@
               <w:t xml:space="preserve">setup()</w:t>
             </w:r>
             <w:r>
-              <w:t xml:space="preserve"> </w:t>
-            </w:r>
-            <w:r>
-              <w:t xml:space="preserve">to change</w:t>
+              <w:t xml:space="preserve"> to change</w:t>
             </w:r>
           </w:p>
         </w:tc>
@@ -6298,10 +6002,7 @@
         <w:pStyle w:val="BodyText"/>
       </w:pPr>
       <w:r>
-        <w:t xml:space="preserve">To change the trigger interval or label names, edit the Config sheet then re-run</w:t>
-      </w:r>
-      <w:r>
-        <w:t xml:space="preserve"> </w:t>
+        <w:t xml:space="preserve">To change the trigger interval or label names, edit the Config sheet then re-run </w:t>
       </w:r>
       <w:r>
         <w:rPr>
@@ -6310,10 +6011,7 @@
         <w:t xml:space="preserve">setup()</w:t>
       </w:r>
       <w:r>
-        <w:t xml:space="preserve"> </w:t>
-      </w:r>
-      <w:r>
-        <w:t xml:space="preserve">to apply.</w:t>
+        <w:t xml:space="preserve"> to apply.</w:t>
       </w:r>
     </w:p>
     <w:p>
@@ -6321,10 +6019,7 @@
         <w:pStyle w:val="BodyText"/>
       </w:pPr>
       <w:r>
-        <w:t xml:space="preserve">To reconfigure from scratch, edit the Config sheet values directly and re-run</w:t>
-      </w:r>
-      <w:r>
-        <w:t xml:space="preserve"> </w:t>
+        <w:t xml:space="preserve">To reconfigure from scratch, edit the Config sheet values directly and re-run </w:t>
       </w:r>
       <w:r>
         <w:rPr>
@@ -6387,10 +6082,7 @@
         <w:pStyle w:val="Compact"/>
       </w:pPr>
       <w:r>
-        <w:t xml:space="preserve">Go to</w:t>
-      </w:r>
-      <w:r>
-        <w:t xml:space="preserve"> </w:t>
+        <w:t xml:space="preserve">Go to </w:t>
       </w:r>
       <w:hyperlink r:id="rId47">
         <w:r>
@@ -6424,10 +6116,7 @@
         <w:pStyle w:val="Compact"/>
       </w:pPr>
       <w:r>
-        <w:t xml:space="preserve">Click it and select</w:t>
-      </w:r>
-      <w:r>
-        <w:t xml:space="preserve"> </w:t>
+        <w:t xml:space="preserve">Click it and select </w:t>
       </w:r>
       <w:r>
         <w:rPr>
@@ -6442,10 +6131,7 @@
         <w:pStyle w:val="FirstParagraph"/>
       </w:pPr>
       <w:r>
-        <w:t xml:space="preserve">This fully revokes OAuth access. The next time you run</w:t>
-      </w:r>
-      <w:r>
-        <w:t xml:space="preserve"> </w:t>
+        <w:t xml:space="preserve">This fully revokes OAuth access. The next time you run </w:t>
       </w:r>
       <w:r>
         <w:rPr>
@@ -6454,10 +6140,7 @@
         <w:t xml:space="preserve">setup()</w:t>
       </w:r>
       <w:r>
-        <w:t xml:space="preserve"> </w:t>
-      </w:r>
-      <w:r>
-        <w:t xml:space="preserve">or install the add-on, Google will show a fresh authorisation dialog.</w:t>
+        <w:t xml:space="preserve"> or install the add-on, Google will show a fresh authorisation dialog.</w:t>
       </w:r>
     </w:p>
     <w:bookmarkEnd w:id="48"/>
@@ -6491,10 +6174,7 @@
         <w:pStyle w:val="Compact"/>
       </w:pPr>
       <w:r>
-        <w:t xml:space="preserve">Click the</w:t>
-      </w:r>
-      <w:r>
-        <w:t xml:space="preserve"> </w:t>
+        <w:t xml:space="preserve">Click the </w:t>
       </w:r>
       <w:r>
         <w:rPr>
@@ -6504,10 +6184,7 @@
         <w:t xml:space="preserve">+</w:t>
       </w:r>
       <w:r>
-        <w:t xml:space="preserve"> </w:t>
-      </w:r>
-      <w:r>
-        <w:t xml:space="preserve">(Get add-ons) icon in the right sidebar</w:t>
+        <w:t xml:space="preserve"> (Get add-ons) icon in the right sidebar</w:t>
       </w:r>
     </w:p>
     <w:p>
@@ -6519,10 +6196,7 @@
         <w:pStyle w:val="Compact"/>
       </w:pPr>
       <w:r>
-        <w:t xml:space="preserve">Find</w:t>
-      </w:r>
-      <w:r>
-        <w:t xml:space="preserve"> </w:t>
+        <w:t xml:space="preserve">Find </w:t>
       </w:r>
       <w:r>
         <w:rPr>
@@ -6532,10 +6206,7 @@
         <w:t xml:space="preserve">Rally Scoring</w:t>
       </w:r>
       <w:r>
-        <w:t xml:space="preserve"> </w:t>
-      </w:r>
-      <w:r>
-        <w:t xml:space="preserve">and click the gear icon</w:t>
+        <w:t xml:space="preserve"> and click the gear icon</w:t>
       </w:r>
     </w:p>
     <w:p>
@@ -6547,10 +6218,7 @@
         <w:pStyle w:val="Compact"/>
       </w:pPr>
       <w:r>
-        <w:t xml:space="preserve">Select</w:t>
-      </w:r>
-      <w:r>
-        <w:t xml:space="preserve"> </w:t>
+        <w:t xml:space="preserve">Select </w:t>
       </w:r>
       <w:r>
         <w:rPr>
@@ -6675,19 +6343,7 @@
         <w:t xml:space="preserve">utility.js</w:t>
       </w:r>
       <w:r>
-        <w:t xml:space="preserve"> </w:t>
-      </w:r>
-      <w:r>
-        <w:t xml:space="preserve">holds manually-run helpers for testing — not part of the app's normal</w:t>
-      </w:r>
-      <w:r>
-        <w:t xml:space="preserve"> </w:t>
-      </w:r>
-      <w:r>
-        <w:t xml:space="preserve">operation, and never called by</w:t>
-      </w:r>
-      <w:r>
-        <w:t xml:space="preserve"> </w:t>
+        <w:t xml:space="preserve"> holds manually-run helpers for testing — not part of the app's normal operation, and never called by </w:t>
       </w:r>
       <w:r>
         <w:rPr>
@@ -6696,10 +6352,7 @@
         <w:t xml:space="preserve">setup()</w:t>
       </w:r>
       <w:r>
-        <w:t xml:space="preserve">,</w:t>
-      </w:r>
-      <w:r>
-        <w:t xml:space="preserve"> </w:t>
+        <w:t xml:space="preserve">, </w:t>
       </w:r>
       <w:r>
         <w:rPr>
@@ -6708,16 +6361,7 @@
         <w:t xml:space="preserve">processEmails()</w:t>
       </w:r>
       <w:r>
-        <w:t xml:space="preserve">, or the sidebar. Add it</w:t>
-      </w:r>
-      <w:r>
-        <w:t xml:space="preserve"> </w:t>
-      </w:r>
-      <w:r>
-        <w:t xml:space="preserve">as its own script file per</w:t>
-      </w:r>
-      <w:r>
-        <w:t xml:space="preserve"> </w:t>
+        <w:t xml:space="preserve">, or the sidebar. Add it as its own script file per </w:t>
       </w:r>
       <w:hyperlink w:anchor="X58cf1a4512d8c75bd398c60f74def16edad80fb">
         <w:r>
@@ -6728,10 +6372,7 @@
         </w:r>
       </w:hyperlink>
       <w:r>
-        <w:t xml:space="preserve"> </w:t>
-      </w:r>
-      <w:r>
-        <w:t xml:space="preserve">so its functions are selectable from the Apps Script editor's function dropdown.</w:t>
+        <w:t xml:space="preserve"> so its functions are selectable from the Apps Script editor's function dropdown.</w:t>
       </w:r>
     </w:p>
     <w:bookmarkStart w:id="52" w:name="delete-all-rider-sheets"/>
@@ -6754,13 +6395,7 @@
         <w:t xml:space="preserve">deleteAllRiderSheets()</w:t>
       </w:r>
       <w:r>
-        <w:t xml:space="preserve"> </w:t>
-      </w:r>
-      <w:r>
-        <w:t xml:space="preserve">removes every sheet</w:t>
-      </w:r>
-      <w:r>
-        <w:t xml:space="preserve"> </w:t>
+        <w:t xml:space="preserve"> removes every sheet </w:t>
       </w:r>
       <w:r>
         <w:rPr>
@@ -6770,13 +6405,7 @@
         <w:t xml:space="preserve">except</w:t>
       </w:r>
       <w:r>
-        <w:t xml:space="preserve"> </w:t>
-      </w:r>
-      <w:r>
-        <w:t xml:space="preserve">the ones listed in its</w:t>
-      </w:r>
-      <w:r>
-        <w:t xml:space="preserve"> </w:t>
+        <w:t xml:space="preserve"> the ones listed in its </w:t>
       </w:r>
       <w:r>
         <w:rPr>
@@ -6785,10 +6414,7 @@
         <w:t xml:space="preserve">keepSheets</w:t>
       </w:r>
       <w:r>
-        <w:t xml:space="preserve"> </w:t>
-      </w:r>
-      <w:r>
-        <w:t xml:space="preserve">array (</w:t>
+        <w:t xml:space="preserve"> array (</w:t>
       </w:r>
       <w:r>
         <w:rPr>
@@ -6797,10 +6423,7 @@
         <w:t xml:space="preserve">Config</w:t>
       </w:r>
       <w:r>
-        <w:t xml:space="preserve">,</w:t>
-      </w:r>
-      <w:r>
-        <w:t xml:space="preserve"> </w:t>
+        <w:t xml:space="preserve">, </w:t>
       </w:r>
       <w:r>
         <w:rPr>
@@ -6809,10 +6432,7 @@
         <w:t xml:space="preserve">Rider Master</w:t>
       </w:r>
       <w:r>
-        <w:t xml:space="preserve">,</w:t>
-      </w:r>
-      <w:r>
-        <w:t xml:space="preserve"> </w:t>
+        <w:t xml:space="preserve">, </w:t>
       </w:r>
       <w:r>
         <w:rPr>
@@ -6821,10 +6441,7 @@
         <w:t xml:space="preserve">Bonus Master</w:t>
       </w:r>
       <w:r>
-        <w:t xml:space="preserve">,</w:t>
-      </w:r>
-      <w:r>
-        <w:t xml:space="preserve"> </w:t>
+        <w:t xml:space="preserve">, </w:t>
       </w:r>
       <w:r>
         <w:rPr>
@@ -6833,16 +6450,7 @@
         <w:t xml:space="preserve">Combo Master</w:t>
       </w:r>
       <w:r>
-        <w:t xml:space="preserve">) —</w:t>
-      </w:r>
-      <w:r>
-        <w:t xml:space="preserve"> </w:t>
-      </w:r>
-      <w:r>
-        <w:t xml:space="preserve">i.e. every rider sheet,</w:t>
-      </w:r>
-      <w:r>
-        <w:t xml:space="preserve"> </w:t>
+        <w:t xml:space="preserve">) — i.e. every rider sheet, </w:t>
       </w:r>
       <w:r>
         <w:rPr>
@@ -6861,10 +6469,7 @@
         <w:t xml:space="preserve">Leader Board</w:t>
       </w:r>
       <w:r>
-        <w:t xml:space="preserve">,</w:t>
-      </w:r>
-      <w:r>
-        <w:t xml:space="preserve"> </w:t>
+        <w:t xml:space="preserve">, </w:t>
       </w:r>
       <w:r>
         <w:rPr>
@@ -6883,22 +6488,7 @@
         <w:t xml:space="preserve">Master Scoring</w:t>
       </w:r>
       <w:r>
-        <w:t xml:space="preserve">. All three</w:t>
-      </w:r>
-      <w:r>
-        <w:t xml:space="preserve"> </w:t>
-      </w:r>
-      <w:r>
-        <w:t xml:space="preserve">are deleted right along with the rider sheets, not kept: they're all regenerated</w:t>
-      </w:r>
-      <w:r>
-        <w:t xml:space="preserve"> </w:t>
-      </w:r>
-      <w:r>
-        <w:t xml:space="preserve">from scratch the next time</w:t>
-      </w:r>
-      <w:r>
-        <w:t xml:space="preserve"> </w:t>
+        <w:t xml:space="preserve">. All three are deleted right along with the rider sheets, not kept: they're all regenerated from scratch the next time </w:t>
       </w:r>
       <w:r>
         <w:rPr>
@@ -6907,22 +6497,7 @@
         <w:t xml:space="preserve">setup()</w:t>
       </w:r>
       <w:r>
-        <w:t xml:space="preserve"> </w:t>
-      </w:r>
-      <w:r>
-        <w:t xml:space="preserve">runs, exactly like a missing rider sheet is.</w:t>
-      </w:r>
-      <w:r>
-        <w:t xml:space="preserve"> </w:t>
-      </w:r>
-      <w:r>
-        <w:t xml:space="preserve">Useful between test runs to reset scoring data without touching your roster/bonus</w:t>
-      </w:r>
-      <w:r>
-        <w:t xml:space="preserve"> </w:t>
-      </w:r>
-      <w:r>
-        <w:t xml:space="preserve">setup.</w:t>
+        <w:t xml:space="preserve"> runs, exactly like a missing rider sheet is. Useful between test runs to reset scoring data without touching your roster/bonus setup.</w:t>
       </w:r>
     </w:p>
     <w:p>
@@ -6934,88 +6509,40 @@
           <w:bCs/>
           <w:b/>
         </w:rPr>
-        <w:t xml:space="preserve">Before running it, open</w:t>
-      </w:r>
-      <w:r>
-        <w:rPr>
+        <w:t xml:space="preserve">Before running it, open </w:t>
+      </w:r>
+      <w:r>
+        <w:rPr>
+          <w:rStyle w:val="VerbatimChar"/>
           <w:bCs/>
           <w:b/>
         </w:rPr>
-        <w:t xml:space="preserve"> </w:t>
-      </w:r>
-      <w:r>
-        <w:rPr>
-          <w:rStyle w:val="VerbatimChar"/>
+        <w:t xml:space="preserve">utility.js</w:t>
+      </w:r>
+      <w:r>
+        <w:rPr>
           <w:bCs/>
           <w:b/>
         </w:rPr>
-        <w:t xml:space="preserve">utility.js</w:t>
-      </w:r>
-      <w:r>
-        <w:rPr>
+        <w:t xml:space="preserve"> and confirm </w:t>
+      </w:r>
+      <w:r>
+        <w:rPr>
+          <w:rStyle w:val="VerbatimChar"/>
           <w:bCs/>
           <w:b/>
         </w:rPr>
-        <w:t xml:space="preserve"> </w:t>
+        <w:t xml:space="preserve">keepSheets</w:t>
       </w:r>
       <w:r>
         <w:rPr>
           <w:bCs/>
           <w:b/>
         </w:rPr>
-        <w:t xml:space="preserve">and confirm</w:t>
-      </w:r>
-      <w:r>
-        <w:rPr>
-          <w:bCs/>
-          <w:b/>
-        </w:rPr>
-        <w:t xml:space="preserve"> </w:t>
-      </w:r>
-      <w:r>
-        <w:rPr>
-          <w:rStyle w:val="VerbatimChar"/>
-          <w:bCs/>
-          <w:b/>
-        </w:rPr>
-        <w:t xml:space="preserve">keepSheets</w:t>
-      </w:r>
-      <w:r>
-        <w:rPr>
-          <w:bCs/>
-          <w:b/>
-        </w:rPr>
-        <w:t xml:space="preserve"> </w:t>
-      </w:r>
-      <w:r>
-        <w:rPr>
-          <w:bCs/>
-          <w:b/>
-        </w:rPr>
-        <w:t xml:space="preserve">actually matches your</w:t>
-      </w:r>
-      <w:r>
-        <w:rPr>
-          <w:bCs/>
-          <w:b/>
-        </w:rPr>
-        <w:t xml:space="preserve"> </w:t>
-      </w:r>
-      <w:r>
-        <w:rPr>
-          <w:bCs/>
-          <w:b/>
-        </w:rPr>
-        <w:t xml:space="preserve">spreadsheet's non-rider tab names.</w:t>
-      </w:r>
-      <w:r>
-        <w:t xml:space="preserve"> </w:t>
-      </w:r>
-      <w:r>
-        <w:t xml:space="preserve">It's an exact-string</w:t>
-      </w:r>
-      <w:r>
-        <w:t xml:space="preserve"> </w:t>
+        <w:t xml:space="preserve"> actually matches your spreadsheet's non-rider tab names.</w:t>
+      </w:r>
+      <w:r>
+        <w:t xml:space="preserve"> It's an exact-string </w:t>
       </w:r>
       <w:r>
         <w:rPr>
@@ -7024,28 +6551,7 @@
         <w:t xml:space="preserve">.includes()</w:t>
       </w:r>
       <w:r>
-        <w:t xml:space="preserve"> </w:t>
-      </w:r>
-      <w:r>
-        <w:t xml:space="preserve">check with no</w:t>
-      </w:r>
-      <w:r>
-        <w:t xml:space="preserve"> </w:t>
-      </w:r>
-      <w:r>
-        <w:t xml:space="preserve">confirmation prompt — a tab name that doesn't match (a typo, a rename, an extra</w:t>
-      </w:r>
-      <w:r>
-        <w:t xml:space="preserve"> </w:t>
-      </w:r>
-      <w:r>
-        <w:t xml:space="preserve">scoring tab you added later) gets deleted right along with the rider sheets, with no</w:t>
-      </w:r>
-      <w:r>
-        <w:t xml:space="preserve"> </w:t>
-      </w:r>
-      <w:r>
-        <w:t xml:space="preserve">way to undo it beyond Google Sheets' version history.</w:t>
+        <w:t xml:space="preserve"> check with no confirmation prompt — a tab name that doesn't match (a typo, a rename, an extra scoring tab you added later) gets deleted right along with the rider sheets, with no way to undo it beyond Google Sheets' version history.</w:t>
       </w:r>
     </w:p>
     <w:p>
@@ -7053,10 +6559,7 @@
         <w:pStyle w:val="BodyText"/>
       </w:pPr>
       <w:r>
-        <w:t xml:space="preserve">Run it from the Apps Script editor: select</w:t>
-      </w:r>
-      <w:r>
-        <w:t xml:space="preserve"> </w:t>
+        <w:t xml:space="preserve">Run it from the Apps Script editor: select </w:t>
       </w:r>
       <w:r>
         <w:rPr>
@@ -7065,19 +6568,7 @@
         <w:t xml:space="preserve">deleteAllRiderSheets</w:t>
       </w:r>
       <w:r>
-        <w:t xml:space="preserve"> </w:t>
-      </w:r>
-      <w:r>
-        <w:t xml:space="preserve">from the function</w:t>
-      </w:r>
-      <w:r>
-        <w:t xml:space="preserve"> </w:t>
-      </w:r>
-      <w:r>
-        <w:t xml:space="preserve">dropdown →</w:t>
-      </w:r>
-      <w:r>
-        <w:t xml:space="preserve"> </w:t>
+        <w:t xml:space="preserve"> from the function dropdown → </w:t>
       </w:r>
       <w:r>
         <w:rPr>
@@ -7169,10 +6660,7 @@
               <w:jc w:val="left"/>
             </w:pPr>
             <w:r>
-              <w:t xml:space="preserve">Create a tab named exactly</w:t>
-            </w:r>
-            <w:r>
-              <w:t xml:space="preserve"> </w:t>
+              <w:t xml:space="preserve">Create a tab named exactly </w:t>
             </w:r>
             <w:r>
               <w:rPr>
@@ -7181,13 +6669,7 @@
               <w:t xml:space="preserve">Config</w:t>
             </w:r>
             <w:r>
-              <w:t xml:space="preserve"> </w:t>
-            </w:r>
-            <w:r>
-              <w:t xml:space="preserve">and populate it per</w:t>
-            </w:r>
-            <w:r>
-              <w:t xml:space="preserve"> </w:t>
+              <w:t xml:space="preserve"> and populate it per </w:t>
             </w:r>
             <w:hyperlink w:anchor="installation">
               <w:r>
@@ -7198,10 +6680,7 @@
               </w:r>
             </w:hyperlink>
             <w:r>
-              <w:t xml:space="preserve">, then re-run</w:t>
-            </w:r>
-            <w:r>
-              <w:t xml:space="preserve"> </w:t>
+              <w:t xml:space="preserve">, then re-run </w:t>
             </w:r>
             <w:r>
               <w:rPr>
@@ -7233,10 +6712,7 @@
               <w:jc w:val="left"/>
             </w:pPr>
             <w:r>
-              <w:t xml:space="preserve">One or more Gmail labels are missing — re-run</w:t>
-            </w:r>
-            <w:r>
-              <w:t xml:space="preserve"> </w:t>
+              <w:t xml:space="preserve">One or more Gmail labels are missing — re-run </w:t>
             </w:r>
             <w:r>
               <w:rPr>
@@ -7256,10 +6732,7 @@
               <w:jc w:val="left"/>
             </w:pPr>
             <w:r>
-              <w:t xml:space="preserve">Email tagged</w:t>
-            </w:r>
-            <w:r>
-              <w:t xml:space="preserve"> </w:t>
+              <w:t xml:space="preserve">Email tagged </w:t>
             </w:r>
             <w:r>
               <w:rPr>
@@ -7291,10 +6764,7 @@
               <w:jc w:val="left"/>
             </w:pPr>
             <w:r>
-              <w:t xml:space="preserve">Email tagged</w:t>
-            </w:r>
-            <w:r>
-              <w:t xml:space="preserve"> </w:t>
+              <w:t xml:space="preserve">Email tagged </w:t>
             </w:r>
             <w:r>
               <w:rPr>
@@ -7326,10 +6796,7 @@
               <w:jc w:val="left"/>
             </w:pPr>
             <w:r>
-              <w:t xml:space="preserve">Email tagged</w:t>
-            </w:r>
-            <w:r>
-              <w:t xml:space="preserve"> </w:t>
+              <w:t xml:space="preserve">Email tagged </w:t>
             </w:r>
             <w:r>
               <w:rPr>
@@ -7393,25 +6860,19 @@
               <w:t xml:space="preserve">must be at least 1, got: "0"</w:t>
             </w:r>
             <w:r>
-              <w:t xml:space="preserve"> </w:t>
-            </w:r>
-            <w:r>
-              <w:t xml:space="preserve">(or similar) when approving/denying</w:t>
-            </w:r>
-          </w:p>
-        </w:tc>
-        <w:tc>
-          <w:tcPr/>
-          <w:p>
-            <w:pPr>
-              <w:pStyle w:val="Compact"/>
-              <w:jc w:val="left"/>
-            </w:pPr>
-            <w:r>
-              <w:t xml:space="preserve">A</w:t>
-            </w:r>
-            <w:r>
-              <w:t xml:space="preserve"> </w:t>
+              <w:t xml:space="preserve"> (or similar) when approving/denying</w:t>
+            </w:r>
+          </w:p>
+        </w:tc>
+        <w:tc>
+          <w:tcPr/>
+          <w:p>
+            <w:pPr>
+              <w:pStyle w:val="Compact"/>
+              <w:jc w:val="left"/>
+            </w:pPr>
+            <w:r>
+              <w:t xml:space="preserve">A </w:t>
             </w:r>
             <w:r>
               <w:rPr>
@@ -7420,13 +6881,7 @@
               <w:t xml:space="preserve">col_*</w:t>
             </w:r>
             <w:r>
-              <w:t xml:space="preserve"> </w:t>
-            </w:r>
-            <w:r>
-              <w:t xml:space="preserve">or</w:t>
-            </w:r>
-            <w:r>
-              <w:t xml:space="preserve"> </w:t>
+              <w:t xml:space="preserve"> or </w:t>
             </w:r>
             <w:r>
               <w:rPr>
@@ -7435,13 +6890,7 @@
               <w:t xml:space="preserve">header_row</w:t>
             </w:r>
             <w:r>
-              <w:t xml:space="preserve"> </w:t>
-            </w:r>
-            <w:r>
-              <w:t xml:space="preserve">key in the Config sheet is</w:t>
-            </w:r>
-            <w:r>
-              <w:t xml:space="preserve"> </w:t>
+              <w:t xml:space="preserve"> key in the Config sheet is </w:t>
             </w:r>
             <w:r>
               <w:rPr>
@@ -7450,13 +6899,7 @@
               <w:t xml:space="preserve">0</w:t>
             </w:r>
             <w:r>
-              <w:t xml:space="preserve"> </w:t>
-            </w:r>
-            <w:r>
-              <w:t xml:space="preserve">or negative — columns and rows are numbered starting at 1. Fix the value in Config; no need to re-run</w:t>
-            </w:r>
-            <w:r>
-              <w:t xml:space="preserve"> </w:t>
+              <w:t xml:space="preserve"> or negative — columns and rows are numbered starting at 1. Fix the value in Config; no need to re-run </w:t>
             </w:r>
             <w:r>
               <w:rPr>
@@ -7488,10 +6931,7 @@
               <w:jc w:val="left"/>
             </w:pPr>
             <w:r>
-              <w:t xml:space="preserve">Tab must be named exactly as configured (default:</w:t>
-            </w:r>
-            <w:r>
-              <w:t xml:space="preserve"> </w:t>
+              <w:t xml:space="preserve">Tab must be named exactly as configured (default: </w:t>
             </w:r>
             <w:r>
               <w:rPr>
@@ -7529,10 +6969,7 @@
               <w:jc w:val="left"/>
             </w:pPr>
             <w:r>
-              <w:t xml:space="preserve">Create your</w:t>
-            </w:r>
-            <w:r>
-              <w:t xml:space="preserve"> </w:t>
+              <w:t xml:space="preserve">Create your </w:t>
             </w:r>
             <w:r>
               <w:rPr>
@@ -7541,13 +6978,7 @@
               <w:t xml:space="preserve">Bonus Master</w:t>
             </w:r>
             <w:r>
-              <w:t xml:space="preserve"> </w:t>
-            </w:r>
-            <w:r>
-              <w:t xml:space="preserve">tab (with a</w:t>
-            </w:r>
-            <w:r>
-              <w:t xml:space="preserve"> </w:t>
+              <w:t xml:space="preserve"> tab (with a </w:t>
             </w:r>
             <w:r>
               <w:rPr>
@@ -7556,13 +6987,7 @@
               <w:t xml:space="preserve">POINTS</w:t>
             </w:r>
             <w:r>
-              <w:t xml:space="preserve"> </w:t>
-            </w:r>
-            <w:r>
-              <w:t xml:space="preserve">column) and re-run</w:t>
-            </w:r>
-            <w:r>
-              <w:t xml:space="preserve"> </w:t>
+              <w:t xml:space="preserve"> column) and re-run </w:t>
             </w:r>
             <w:r>
               <w:rPr>
@@ -7571,13 +6996,7 @@
               <w:t xml:space="preserve">setup()</w:t>
             </w:r>
             <w:r>
-              <w:t xml:space="preserve"> </w:t>
-            </w:r>
-            <w:r>
-              <w:t xml:space="preserve">— everything else</w:t>
-            </w:r>
-            <w:r>
-              <w:t xml:space="preserve"> </w:t>
+              <w:t xml:space="preserve"> — everything else </w:t>
             </w:r>
             <w:r>
               <w:rPr>
@@ -7586,10 +7005,7 @@
               <w:t xml:space="preserve">setup()</w:t>
             </w:r>
             <w:r>
-              <w:t xml:space="preserve"> </w:t>
-            </w:r>
-            <w:r>
-              <w:t xml:space="preserve">does still completes even with this error</w:t>
+              <w:t xml:space="preserve"> does still completes even with this error</w:t>
             </w:r>
           </w:p>
         </w:tc>
@@ -7618,10 +7034,7 @@
               <w:jc w:val="left"/>
             </w:pPr>
             <w:r>
-              <w:t xml:space="preserve">Only happens if the above also failed — fix</w:t>
-            </w:r>
-            <w:r>
-              <w:t xml:space="preserve"> </w:t>
+              <w:t xml:space="preserve">Only happens if the above also failed — fix </w:t>
             </w:r>
             <w:r>
               <w:rPr>
@@ -7630,13 +7043,7 @@
               <w:t xml:space="preserve">Bonus Master</w:t>
             </w:r>
             <w:r>
-              <w:t xml:space="preserve"> </w:t>
-            </w:r>
-            <w:r>
-              <w:t xml:space="preserve">first, then re-run</w:t>
-            </w:r>
-            <w:r>
-              <w:t xml:space="preserve"> </w:t>
+              <w:t xml:space="preserve"> first, then re-run </w:t>
             </w:r>
             <w:r>
               <w:rPr>
@@ -7723,10 +7130,7 @@
               <w:jc w:val="left"/>
             </w:pPr>
             <w:r>
-              <w:t xml:space="preserve">Go to</w:t>
-            </w:r>
-            <w:r>
-              <w:t xml:space="preserve"> </w:t>
+              <w:t xml:space="preserve">Go to </w:t>
             </w:r>
             <w:hyperlink r:id="rId47">
               <w:r>
@@ -7737,10 +7141,7 @@
               </w:r>
             </w:hyperlink>
             <w:r>
-              <w:t xml:space="preserve">, remove the connection, then re-run</w:t>
-            </w:r>
-            <w:r>
-              <w:t xml:space="preserve"> </w:t>
+              <w:t xml:space="preserve">, remove the connection, then re-run </w:t>
             </w:r>
             <w:r>
               <w:rPr>
@@ -7772,10 +7173,7 @@
               <w:jc w:val="left"/>
             </w:pPr>
             <w:r>
-              <w:t xml:space="preserve">Apps Script → Triggers — confirm</w:t>
-            </w:r>
-            <w:r>
-              <w:t xml:space="preserve"> </w:t>
+              <w:t xml:space="preserve">Apps Script → Triggers — confirm </w:t>
             </w:r>
             <w:r>
               <w:rPr>
@@ -7784,13 +7182,7 @@
               <w:t xml:space="preserve">processEmails</w:t>
             </w:r>
             <w:r>
-              <w:t xml:space="preserve"> </w:t>
-            </w:r>
-            <w:r>
-              <w:t xml:space="preserve">exists; re-run</w:t>
-            </w:r>
-            <w:r>
-              <w:t xml:space="preserve"> </w:t>
+              <w:t xml:space="preserve"> exists; re-run </w:t>
             </w:r>
             <w:r>
               <w:rPr>
@@ -7799,10 +7191,7 @@
               <w:t xml:space="preserve">setup()</w:t>
             </w:r>
             <w:r>
-              <w:t xml:space="preserve"> </w:t>
-            </w:r>
-            <w:r>
-              <w:t xml:space="preserve">if not</w:t>
+              <w:t xml:space="preserve"> if not</w:t>
             </w:r>
           </w:p>
         </w:tc>
@@ -7822,10 +7211,7 @@
         <w:pStyle w:val="FirstParagraph"/>
       </w:pPr>
       <w:r>
-        <w:t xml:space="preserve">Apps Script →</w:t>
-      </w:r>
-      <w:r>
-        <w:t xml:space="preserve"> </w:t>
+        <w:t xml:space="preserve">Apps Script → </w:t>
       </w:r>
       <w:r>
         <w:rPr>
@@ -7835,10 +7221,7 @@
         <w:t xml:space="preserve">Executions</w:t>
       </w:r>
       <w:r>
-        <w:t xml:space="preserve"> </w:t>
-      </w:r>
-      <w:r>
-        <w:t xml:space="preserve">in the left sidebar → click any run to expand its log. The script logs every action, validation result, and error with a clear message — this includes sidebar button clicks (Approve/Deny/Revert), not just the time-driven trigger: every guard clause and failure in the sidebar's handlers writes a log line naming the function and the thread/message involved, so a scorer-facing error toast always has a matching entry here to dig into.</w:t>
+        <w:t xml:space="preserve"> in the left sidebar → click any run to expand its log. The script logs every action, validation result, and error with a clear message — this includes sidebar button clicks (Approve/Deny/Revert), not just the time-driven trigger: every guard clause and failure in the sidebar's handlers writes a log line naming the function and the thread/message involved, so a scorer-facing error toast always has a matching entry here to dig into.</w:t>
       </w:r>
     </w:p>
     <w:p>
@@ -8010,10 +7393,7 @@
               <w:jc w:val="left"/>
             </w:pPr>
             <w:r>
-              <w:t xml:space="preserve">Create time-driven trigger in</w:t>
-            </w:r>
-            <w:r>
-              <w:t xml:space="preserve"> </w:t>
+              <w:t xml:space="preserve">Create time-driven trigger in </w:t>
             </w:r>
             <w:r>
               <w:rPr>
@@ -8048,10 +7428,7 @@
               <w:jc w:val="left"/>
             </w:pPr>
             <w:r>
-              <w:t xml:space="preserve">Reserved for future use — nothing currently calls</w:t>
-            </w:r>
-            <w:r>
-              <w:t xml:space="preserve"> </w:t>
+              <w:t xml:space="preserve">Reserved for future use — nothing currently calls </w:t>
             </w:r>
             <w:r>
               <w:rPr>
@@ -8086,10 +7463,7 @@
               <w:jc w:val="left"/>
             </w:pPr>
             <w:r>
-              <w:t xml:space="preserve">Required because the manifest sets</w:t>
-            </w:r>
-            <w:r>
-              <w:t xml:space="preserve"> </w:t>
+              <w:t xml:space="preserve">Required because the manifest sets </w:t>
             </w:r>
             <w:r>
               <w:rPr>
@@ -8106,10 +7480,7 @@
         <w:pStyle w:val="BodyText"/>
       </w:pPr>
       <w:r>
-        <w:t xml:space="preserve">If you already installed the add-on before</w:t>
-      </w:r>
-      <w:r>
-        <w:t xml:space="preserve"> </w:t>
+        <w:t xml:space="preserve">If you already installed the add-on before </w:t>
       </w:r>
       <w:r>
         <w:rPr>
@@ -8118,13 +7489,7 @@
         <w:t xml:space="preserve">script.locale</w:t>
       </w:r>
       <w:r>
-        <w:t xml:space="preserve"> </w:t>
-      </w:r>
-      <w:r>
-        <w:t xml:space="preserve">was added to</w:t>
-      </w:r>
-      <w:r>
-        <w:t xml:space="preserve"> </w:t>
+        <w:t xml:space="preserve"> was added to </w:t>
       </w:r>
       <w:r>
         <w:rPr>
@@ -8133,10 +7498,7 @@
         <w:t xml:space="preserve">appsscript.json</w:t>
       </w:r>
       <w:r>
-        <w:t xml:space="preserve">, Apps Script will prompt for re-authorization the next time you run a function or open the sidebar — accept it once to pick up the new scope. See</w:t>
-      </w:r>
-      <w:r>
-        <w:t xml:space="preserve"> </w:t>
+        <w:t xml:space="preserve">, Apps Script will prompt for re-authorization the next time you run a function or open the sidebar — accept it once to pick up the new scope. See </w:t>
       </w:r>
       <w:hyperlink w:anchor="removing-and-reinstalling-the-add-on">
         <w:r>
@@ -8147,10 +7509,7 @@
         </w:r>
       </w:hyperlink>
       <w:r>
-        <w:t xml:space="preserve"> </w:t>
-      </w:r>
-      <w:r>
-        <w:t xml:space="preserve">if it doesn't prompt on its own.</w:t>
+        <w:t xml:space="preserve"> if it doesn't prompt on its own.</w:t>
       </w:r>
     </w:p>
     <w:p>
@@ -8175,10 +7534,7 @@
         <w:pStyle w:val="FirstParagraph"/>
       </w:pPr>
       <w:r>
-        <w:t xml:space="preserve">GNU General Public License v3.0 or later — see</w:t>
-      </w:r>
-      <w:r>
-        <w:t xml:space="preserve"> </w:t>
+        <w:t xml:space="preserve">GNU General Public License v3.0 or later — see </w:t>
       </w:r>
       <w:hyperlink r:id="rId57">
         <w:r>

</xml_diff>